<commit_message>
Update frontend components to enhance chat functionality with Markdown support and chat history management. Added 'marked' library for rendering Markdown in messages, improved layout and styling for user and assistant messages, and implemented a chat history section in the sidebar.
</commit_message>
<xml_diff>
--- a/Bachelor_proj_report.docx
+++ b/Bachelor_proj_report.docx
@@ -4,13 +4,16 @@
   <w:body>
     <w:p>
       <w:pPr>
-        <w:pStyle w:val="Title"/>
+        <w:spacing w:before="720" w:after="480"/>
         <w:jc w:val="center"/>
         <w:bidi w:val="1"/>
       </w:pPr>
       <w:r>
         <w:rPr>
           <w:rFonts w:ascii="Vazirmatn" w:hAnsi="Vazirmatn"/>
+          <w:b/>
+          <w:color w:val="0F172A"/>
+          <w:sz w:val="44"/>
           <w:rtl w:val="1"/>
           <w:rFonts w:ascii="Vazirmatn" w:hAnsi="Vazirmatn" w:cs="Vazirmatn" w:eastAsia="Vazirmatn"/>
         </w:rPr>
@@ -19,7 +22,6 @@
     </w:p>
     <w:p>
       <w:r>
-        <w:br/>
         <w:br/>
         <w:br/>
       </w:r>
@@ -33,11 +35,12 @@
         <w:rPr>
           <w:rFonts w:ascii="Vazirmatn" w:hAnsi="Vazirmatn"/>
           <w:b/>
+          <w:color w:val="334155"/>
           <w:sz w:val="32"/>
           <w:rtl w:val="1"/>
           <w:rFonts w:ascii="Vazirmatn" w:hAnsi="Vazirmatn" w:cs="Vazirmatn" w:eastAsia="Vazirmatn"/>
         </w:rPr>
-        <w:t xml:space="preserve">پروژه کارشناسی </w:t>
+        <w:t>درس هوش مصنوعی - استاد تاج بخش</w:t>
       </w:r>
     </w:p>
     <w:p>
@@ -49,22 +52,7 @@
         <w:rPr>
           <w:rFonts w:ascii="Vazirmatn" w:hAnsi="Vazirmatn"/>
           <w:b/>
-          <w:sz w:val="32"/>
-          <w:rtl w:val="1"/>
-          <w:rFonts w:ascii="Vazirmatn" w:hAnsi="Vazirmatn" w:cs="Vazirmatn" w:eastAsia="Vazirmatn"/>
-        </w:rPr>
-        <w:t xml:space="preserve"> استاد تاج بخش</w:t>
-      </w:r>
-    </w:p>
-    <w:p>
-      <w:pPr>
-        <w:jc w:val="center"/>
-        <w:bidi w:val="1"/>
-      </w:pPr>
-      <w:r>
-        <w:rPr>
-          <w:rFonts w:ascii="Vazirmatn" w:hAnsi="Vazirmatn"/>
-          <w:b/>
+          <w:color w:val="334155"/>
           <w:sz w:val="28"/>
           <w:rtl w:val="1"/>
           <w:rFonts w:ascii="Vazirmatn" w:hAnsi="Vazirmatn" w:cs="Vazirmatn" w:eastAsia="Vazirmatn"/>
@@ -80,11 +68,12 @@
       <w:r>
         <w:rPr>
           <w:rFonts w:ascii="Vazirmatn" w:hAnsi="Vazirmatn"/>
-          <w:sz w:val="28"/>
+          <w:color w:val="64748B"/>
+          <w:sz w:val="26"/>
           <w:rtl w:val="1"/>
           <w:rFonts w:ascii="Vazirmatn" w:hAnsi="Vazirmatn" w:cs="Vazirmatn" w:eastAsia="Vazirmatn"/>
         </w:rPr>
-        <w:t xml:space="preserve"> تابستان ۱۴۰۵</w:t>
+        <w:t>تابستان ۱۴۰۵</w:t>
       </w:r>
     </w:p>
     <w:p>
@@ -95,26 +84,37 @@
     <w:p>
       <w:pPr>
         <w:pStyle w:val="Heading1"/>
+        <w:spacing w:before="360" w:after="160"/>
+        <w:jc w:val="right"/>
+        <w:bidi w:val="1"/>
+        <w:outlineLvl w:val="0"/>
+        <w:keepNext/>
+      </w:pPr>
+      <w:r>
+        <w:rPr>
+          <w:rFonts w:ascii="Vazirmatn" w:hAnsi="Vazirmatn"/>
+          <w:b/>
+          <w:color w:val="E91E63"/>
+          <w:sz w:val="36"/>
+          <w:rtl w:val="1"/>
+          <w:rFonts w:ascii="Vazirmatn" w:hAnsi="Vazirmatn" w:cs="Vazirmatn" w:eastAsia="Vazirmatn"/>
+          <w:color w:val="E91E63"/>
+        </w:rPr>
+        <w:t>فهرست مطالب</w:t>
+      </w:r>
+    </w:p>
+    <w:p>
+      <w:pPr>
+        <w:spacing w:after="80" w:line="276" w:lineRule="auto"/>
         <w:jc w:val="right"/>
         <w:bidi w:val="1"/>
       </w:pPr>
       <w:r>
         <w:rPr>
           <w:rFonts w:ascii="Vazirmatn" w:hAnsi="Vazirmatn"/>
-          <w:rtl w:val="1"/>
-          <w:rFonts w:ascii="Vazirmatn" w:hAnsi="Vazirmatn" w:cs="Vazirmatn" w:eastAsia="Vazirmatn"/>
-        </w:rPr>
-        <w:t>فهرست مطالب</w:t>
-      </w:r>
-    </w:p>
-    <w:p>
-      <w:pPr>
-        <w:jc w:val="right"/>
-        <w:bidi w:val="1"/>
-      </w:pPr>
-      <w:r>
-        <w:rPr>
-          <w:rFonts w:ascii="Vazirmatn" w:hAnsi="Vazirmatn"/>
+          <w:b/>
+          <w:color w:val="E91E63"/>
+          <w:sz w:val="23"/>
           <w:rtl w:val="1"/>
           <w:rFonts w:ascii="Vazirmatn" w:hAnsi="Vazirmatn" w:cs="Vazirmatn" w:eastAsia="Vazirmatn"/>
         </w:rPr>
@@ -123,12 +123,16 @@
     </w:p>
     <w:p>
       <w:pPr>
+        <w:spacing w:after="80" w:line="276" w:lineRule="auto"/>
         <w:jc w:val="right"/>
         <w:bidi w:val="1"/>
       </w:pPr>
       <w:r>
         <w:rPr>
           <w:rFonts w:ascii="Vazirmatn" w:hAnsi="Vazirmatn"/>
+          <w:b/>
+          <w:color w:val="E91E63"/>
+          <w:sz w:val="23"/>
           <w:rtl w:val="1"/>
           <w:rFonts w:ascii="Vazirmatn" w:hAnsi="Vazirmatn" w:cs="Vazirmatn" w:eastAsia="Vazirmatn"/>
         </w:rPr>
@@ -137,12 +141,16 @@
     </w:p>
     <w:p>
       <w:pPr>
+        <w:spacing w:after="80" w:line="276" w:lineRule="auto"/>
         <w:jc w:val="right"/>
         <w:bidi w:val="1"/>
       </w:pPr>
       <w:r>
         <w:rPr>
           <w:rFonts w:ascii="Vazirmatn" w:hAnsi="Vazirmatn"/>
+          <w:b/>
+          <w:color w:val="E91E63"/>
+          <w:sz w:val="23"/>
           <w:rtl w:val="1"/>
           <w:rFonts w:ascii="Vazirmatn" w:hAnsi="Vazirmatn" w:cs="Vazirmatn" w:eastAsia="Vazirmatn"/>
         </w:rPr>
@@ -153,120 +161,165 @@
       <w:pPr>
         <w:jc w:val="right"/>
         <w:bidi w:val="1"/>
+        <w:spacing w:after="80" w:line="276" w:lineRule="auto"/>
+        <w:ind w:right="360"/>
       </w:pPr>
       <w:r>
         <w:rPr>
           <w:rFonts w:ascii="Vazirmatn" w:hAnsi="Vazirmatn"/>
+          <w:b/>
+          <w:color w:val="C2185B"/>
+          <w:sz w:val="21"/>
           <w:rtl w:val="1"/>
           <w:rFonts w:ascii="Vazirmatn" w:hAnsi="Vazirmatn" w:cs="Vazirmatn" w:eastAsia="Vazirmatn"/>
         </w:rPr>
-        <w:t xml:space="preserve">   ۳.۱. ایجنت‌های هوشمند (Agno Agents)</w:t>
+        <w:t>۳.۱. ایجنت‌های هوشمند (Agno Agents)</w:t>
       </w:r>
     </w:p>
     <w:p>
       <w:pPr>
         <w:jc w:val="right"/>
         <w:bidi w:val="1"/>
+        <w:spacing w:after="80" w:line="276" w:lineRule="auto"/>
+        <w:ind w:right="360"/>
       </w:pPr>
       <w:r>
         <w:rPr>
           <w:rFonts w:ascii="Vazirmatn" w:hAnsi="Vazirmatn"/>
+          <w:b/>
+          <w:color w:val="C2185B"/>
+          <w:sz w:val="21"/>
           <w:rtl w:val="1"/>
           <w:rFonts w:ascii="Vazirmatn" w:hAnsi="Vazirmatn" w:cs="Vazirmatn" w:eastAsia="Vazirmatn"/>
         </w:rPr>
-        <w:t xml:space="preserve">   ۳.۲. ابزارهای تحلیلی (ToolKits)</w:t>
+        <w:t>۳.۲. ابزارهای تحلیلی (ToolKits)</w:t>
       </w:r>
     </w:p>
     <w:p>
       <w:pPr>
         <w:jc w:val="right"/>
         <w:bidi w:val="1"/>
+        <w:spacing w:after="80" w:line="276" w:lineRule="auto"/>
+        <w:ind w:right="360"/>
       </w:pPr>
       <w:r>
         <w:rPr>
           <w:rFonts w:ascii="Vazirmatn" w:hAnsi="Vazirmatn"/>
+          <w:b/>
+          <w:color w:val="C2185B"/>
+          <w:sz w:val="21"/>
           <w:rtl w:val="1"/>
           <w:rFonts w:ascii="Vazirmatn" w:hAnsi="Vazirmatn" w:cs="Vazirmatn" w:eastAsia="Vazirmatn"/>
         </w:rPr>
-        <w:t xml:space="preserve">   ۳.۳. هماهنگ‌کننده و مسیریابی (Orchestrator)</w:t>
+        <w:t>۳.۳. هماهنگ‌کننده و مسیریابی (Orchestrator)</w:t>
       </w:r>
     </w:p>
     <w:p>
       <w:pPr>
         <w:jc w:val="right"/>
         <w:bidi w:val="1"/>
+        <w:spacing w:after="80" w:line="276" w:lineRule="auto"/>
+        <w:ind w:right="360"/>
       </w:pPr>
       <w:r>
         <w:rPr>
           <w:rFonts w:ascii="Vazirmatn" w:hAnsi="Vazirmatn"/>
+          <w:b/>
+          <w:color w:val="C2185B"/>
+          <w:sz w:val="21"/>
           <w:rtl w:val="1"/>
           <w:rFonts w:ascii="Vazirmatn" w:hAnsi="Vazirmatn" w:cs="Vazirmatn" w:eastAsia="Vazirmatn"/>
         </w:rPr>
-        <w:t xml:space="preserve">   ۳.۴. پایگاه داده و ذخیره‌سازی داده‌ها (PostgreSQL &amp; Redis)</w:t>
+        <w:t>۳.۴. پایگاه داده و ذخیره‌سازی داده‌ها (PostgreSQL &amp; Redis)</w:t>
       </w:r>
     </w:p>
     <w:p>
       <w:pPr>
         <w:jc w:val="right"/>
         <w:bidi w:val="1"/>
-        <w:bidi w:val="1"/>
+        <w:spacing w:after="80" w:line="276" w:lineRule="auto"/>
+        <w:ind w:right="360"/>
       </w:pPr>
-      <w:r/>
       <w:r>
         <w:rPr>
           <w:rFonts w:ascii="Vazirmatn" w:hAnsi="Vazirmatn"/>
+          <w:b/>
+          <w:color w:val="C2185B"/>
+          <w:sz w:val="21"/>
           <w:rtl w:val="1"/>
           <w:rFonts w:ascii="Vazirmatn" w:hAnsi="Vazirmatn" w:cs="Vazirmatn" w:eastAsia="Vazirmatn"/>
         </w:rPr>
-        <w:t>جهت مدیریت نشست‌های کاری (Conversations)، ذخیره‌سازی پیام‌ها، نگه‌داری متاداده‌های تحلیلی و ثبت بازخوردهای کاربران، بک‌اند سیستم از پایگاه داده رابطه‌ای PostgreSQL به همراه ORM قدرتمند جنگو استفاده می‌کند. مهم‌ترین مدل‌های ذخیره‌سازی طراحی‌شده عبارتند از:</w:t>
-        <w:br/>
-        <w:t>- Conversation: نگه‌داری شناسه یکتای نشست (UUID)، شناسه کاربر (user_id)، وضعیت آرشیو (is_archive) و زمان‌بندی ایجاد و به‌روزرسانی.</w:t>
-        <w:br/>
-        <w:t>- Message: مدل اصلی ذخیره‌سازی پیام‌ها شامل متن پرسش کاربر (question)، پاسخ تولیدشده توسط ایجنت (answer)، قیمت محاسباتی به دلار (price)، مدل هوش مصنوعی (model مانند gpt-4o, o3-mini)، وضعیت اجرای درخواست (status)، سطح استدلال (reasoning)، مدت زمان تولید پاسخ (answer_generation_duration) و فیلدهای ساختاریافته JSON (تحت عنوان analysis برای تحلیل تکنیکال و analysis_fundamental برای تحلیل آن‌چین و جریان پول هوشمند).</w:t>
-        <w:br/>
-        <w:t>- Feedback: ثبت بازخوردهای کیفی کاربران (لایک / دیس‌لایک) به همراه شناسه کاربر و کلید خارجی متصل به پیام جهت سنجش دقیق کیفیت ایجنت‌ها.</w:t>
-        <w:br/>
-        <w:t>- ProblemReport: سیستم ثبت و پیگیری گزارش خطاهای کاربران به همراه وضعیت بررسی (Open/Close) و پاسخ مدیر سیستم (close_admin_id).</w:t>
-        <w:br/>
-        <w:t>همچنین پایگاه داده کلید-مقدار Redis به عنوان Broker پیام‌رسان برای مدیریت وظایف پیش‌زمینه (Asynchronous Tasks) و لایه لایه‌بندی حافظه پنهان (Caching) استفاده گردیده است.</w:t>
+        <w:t>۳.۵. مکانیزم دریافت خودکار و زنده داده‌ها (Live Data Auto-Fetching)</w:t>
+      </w:r>
+    </w:p>
+    <w:p>
+      <w:pPr>
+        <w:spacing w:after="80" w:line="276" w:lineRule="auto"/>
+        <w:jc w:val="right"/>
+        <w:bidi w:val="1"/>
+      </w:pPr>
+      <w:r>
+        <w:rPr>
+          <w:rFonts w:ascii="Vazirmatn" w:hAnsi="Vazirmatn"/>
+          <w:b/>
+          <w:color w:val="E91E63"/>
+          <w:sz w:val="23"/>
+          <w:rtl w:val="1"/>
+          <w:rFonts w:ascii="Vazirmatn" w:hAnsi="Vazirmatn" w:cs="Vazirmatn" w:eastAsia="Vazirmatn"/>
+        </w:rPr>
+        <w:t>۴. معماری فرانت‌اند</w:t>
       </w:r>
     </w:p>
     <w:p>
       <w:pPr>
         <w:jc w:val="right"/>
         <w:bidi w:val="1"/>
+        <w:spacing w:after="80" w:line="276" w:lineRule="auto"/>
+        <w:ind w:right="360"/>
       </w:pPr>
       <w:r>
         <w:rPr>
           <w:rFonts w:ascii="Vazirmatn" w:hAnsi="Vazirmatn"/>
+          <w:b/>
+          <w:color w:val="C2185B"/>
+          <w:sz w:val="21"/>
           <w:rtl w:val="1"/>
           <w:rFonts w:ascii="Vazirmatn" w:hAnsi="Vazirmatn" w:cs="Vazirmatn" w:eastAsia="Vazirmatn"/>
         </w:rPr>
-        <w:t xml:space="preserve">   ۴.۱. پشته فناوری (Tech Stack)</w:t>
+        <w:t>۴.۱. پشته فناوری (Tech Stack)</w:t>
       </w:r>
     </w:p>
     <w:p>
       <w:pPr>
         <w:jc w:val="right"/>
         <w:bidi w:val="1"/>
+        <w:spacing w:after="80" w:line="276" w:lineRule="auto"/>
+        <w:ind w:right="360"/>
       </w:pPr>
       <w:r>
         <w:rPr>
           <w:rFonts w:ascii="Vazirmatn" w:hAnsi="Vazirmatn"/>
+          <w:b/>
+          <w:color w:val="C2185B"/>
+          <w:sz w:val="21"/>
           <w:rtl w:val="1"/>
           <w:rFonts w:ascii="Vazirmatn" w:hAnsi="Vazirmatn" w:cs="Vazirmatn" w:eastAsia="Vazirmatn"/>
         </w:rPr>
-        <w:t xml:space="preserve">   ۴.۲. کامپوننت‌های مهم و کلاس‌ها</w:t>
+        <w:t>۴.۲. کامپوننت‌های مهم و کلاس‌ها</w:t>
       </w:r>
     </w:p>
     <w:p>
       <w:pPr>
+        <w:spacing w:after="80" w:line="276" w:lineRule="auto"/>
         <w:jc w:val="right"/>
         <w:bidi w:val="1"/>
       </w:pPr>
       <w:r>
         <w:rPr>
           <w:rFonts w:ascii="Vazirmatn" w:hAnsi="Vazirmatn"/>
+          <w:b/>
+          <w:color w:val="E91E63"/>
+          <w:sz w:val="23"/>
           <w:rtl w:val="1"/>
           <w:rFonts w:ascii="Vazirmatn" w:hAnsi="Vazirmatn" w:cs="Vazirmatn" w:eastAsia="Vazirmatn"/>
         </w:rPr>
@@ -277,52 +330,71 @@
       <w:pPr>
         <w:jc w:val="right"/>
         <w:bidi w:val="1"/>
+        <w:spacing w:after="80" w:line="276" w:lineRule="auto"/>
+        <w:ind w:right="360"/>
       </w:pPr>
       <w:r>
         <w:rPr>
           <w:rFonts w:ascii="Vazirmatn" w:hAnsi="Vazirmatn"/>
+          <w:b/>
+          <w:color w:val="C2185B"/>
+          <w:sz w:val="21"/>
           <w:rtl w:val="1"/>
           <w:rFonts w:ascii="Vazirmatn" w:hAnsi="Vazirmatn" w:cs="Vazirmatn" w:eastAsia="Vazirmatn"/>
         </w:rPr>
-        <w:t xml:space="preserve">   ۵.۱. تست‌های واحد و یکپارچه‌سازی بک‌اند (Pytest Suite)</w:t>
+        <w:t>۵.۱. تست‌های واحد و یکپارچه‌سازی بک‌اند (Pytest Suite)</w:t>
       </w:r>
     </w:p>
     <w:p>
       <w:pPr>
         <w:jc w:val="right"/>
         <w:bidi w:val="1"/>
+        <w:spacing w:after="80" w:line="276" w:lineRule="auto"/>
+        <w:ind w:right="360"/>
       </w:pPr>
       <w:r>
         <w:rPr>
           <w:rFonts w:ascii="Vazirmatn" w:hAnsi="Vazirmatn"/>
+          <w:b/>
+          <w:color w:val="C2185B"/>
+          <w:sz w:val="21"/>
           <w:rtl w:val="1"/>
           <w:rFonts w:ascii="Vazirmatn" w:hAnsi="Vazirmatn" w:cs="Vazirmatn" w:eastAsia="Vazirmatn"/>
         </w:rPr>
-        <w:t xml:space="preserve">   ۵.۲. تست محاسبات تریدینگ و لوریج</w:t>
+        <w:t>۵.۲. تست محاسبات تریدینگ و لوریج</w:t>
       </w:r>
     </w:p>
     <w:p>
       <w:pPr>
         <w:jc w:val="right"/>
         <w:bidi w:val="1"/>
+        <w:spacing w:after="80" w:line="276" w:lineRule="auto"/>
+        <w:ind w:right="360"/>
       </w:pPr>
       <w:r>
         <w:rPr>
           <w:rFonts w:ascii="Vazirmatn" w:hAnsi="Vazirmatn"/>
+          <w:b/>
+          <w:color w:val="C2185B"/>
+          <w:sz w:val="21"/>
           <w:rtl w:val="1"/>
           <w:rFonts w:ascii="Vazirmatn" w:hAnsi="Vazirmatn" w:cs="Vazirmatn" w:eastAsia="Vazirmatn"/>
         </w:rPr>
-        <w:t xml:space="preserve">   ۵.۳. تست آداپتور فرانت‌اند و API</w:t>
+        <w:t>۵.۳. تست آداپتور فرانت‌اند و API</w:t>
       </w:r>
     </w:p>
     <w:p>
       <w:pPr>
+        <w:spacing w:after="80" w:line="276" w:lineRule="auto"/>
         <w:jc w:val="right"/>
         <w:bidi w:val="1"/>
       </w:pPr>
       <w:r>
         <w:rPr>
           <w:rFonts w:ascii="Vazirmatn" w:hAnsi="Vazirmatn"/>
+          <w:b/>
+          <w:color w:val="E91E63"/>
+          <w:sz w:val="23"/>
           <w:rtl w:val="1"/>
           <w:rFonts w:ascii="Vazirmatn" w:hAnsi="Vazirmatn" w:cs="Vazirmatn" w:eastAsia="Vazirmatn"/>
         </w:rPr>
@@ -337,61 +409,79 @@
     <w:p>
       <w:pPr>
         <w:pStyle w:val="Heading1"/>
+        <w:spacing w:before="360" w:after="160"/>
+        <w:jc w:val="right"/>
+        <w:bidi w:val="1"/>
+        <w:outlineLvl w:val="0"/>
+        <w:keepNext/>
+      </w:pPr>
+      <w:r>
+        <w:rPr>
+          <w:rFonts w:ascii="Vazirmatn" w:hAnsi="Vazirmatn"/>
+          <w:b/>
+          <w:color w:val="E91E63"/>
+          <w:sz w:val="36"/>
+          <w:rtl w:val="1"/>
+          <w:rFonts w:ascii="Vazirmatn" w:hAnsi="Vazirmatn" w:cs="Vazirmatn" w:eastAsia="Vazirmatn"/>
+          <w:color w:val="E91E63"/>
+        </w:rPr>
+        <w:t>۱. چکیده</w:t>
+      </w:r>
+    </w:p>
+    <w:p>
+      <w:pPr>
+        <w:spacing w:line="300" w:lineRule="auto" w:after="160"/>
         <w:jc w:val="right"/>
         <w:bidi w:val="1"/>
       </w:pPr>
       <w:r>
         <w:rPr>
           <w:rFonts w:ascii="Vazirmatn" w:hAnsi="Vazirmatn"/>
+          <w:color w:val="212529"/>
+          <w:sz w:val="22"/>
           <w:rtl w:val="1"/>
           <w:rFonts w:ascii="Vazirmatn" w:hAnsi="Vazirmatn" w:cs="Vazirmatn" w:eastAsia="Vazirmatn"/>
+          <w:color w:val="212529"/>
         </w:rPr>
-        <w:t>۱. چکیده</w:t>
-      </w:r>
-    </w:p>
-    <w:p>
-      <w:pPr>
-        <w:jc w:val="right"/>
-        <w:bidi w:val="1"/>
-        <w:bidi w:val="1"/>
-      </w:pPr>
-      <w:r/>
-      <w:r>
-        <w:rPr>
-          <w:rFonts w:ascii="Vazirmatn" w:hAnsi="Vazirmatn"/>
-          <w:rtl w:val="1"/>
-          <w:rFonts w:ascii="Vazirmatn" w:hAnsi="Vazirmatn" w:cs="Vazirmatn" w:eastAsia="Vazirmatn"/>
-        </w:rPr>
-        <w:t>این گزارش به بررسی معماری، طراحی و پیاده‌سازی پروژه دستیار هوشمند بازار کریپتو (دستیار هوش مصنوعی تریدینگ بر اساس مدل‌های زبانی) می‌پردازد. این پروژه پیش‌تر برای پلتفرم parsiancrpto.com طراحی و توسعه داده شده بود و تمرکز اصلی آن بر روی ایجاد یک معماری مبتنی بر ایجنت (Agentic Architecture) با بهره‌گیری از فریم‌ورک Agno و پایگاه داده PostgreSQL و Redis است تا بتواند به صورت هوشمندانه و پایدار به سوالات عمومی، تحلیل‌های تکنیکال و داده‌های درون زنجیره‌ای (On-Chain) پاسخ دهد. همچنین در بخش فرانت‌اند، از فریم‌ورک Astro برای پیاده‌سازی یک رابط کاربری مدرن، تاریک و راست‌چین استفاده شده است.</w:t>
+        <w:t>این گزارش به بررسی معماری، طراحی و پیاده‌سازی پروژه دستیار هوشمند بازار کریپتو (دستیار هوش مصنوعی تریدینگ بر اساس مدل‌های زبانی) می‌پردازد. این پروژه پیش‌تر برای پلتفرم parsiancrpto.com طراحی و توسعه داده شده بود و تمرکز اصلی آن بر روی ایجاد یک معماری مبتنی بر ایجنت (Agentic Architecture) با بهره‌گیری از فریم‌ورک Agno، پایگاه داده PostgreSQL و Redis، و سیستم دریافت خودکار و زنده داده‌های بازار (Live Market &amp; On-Chain Auto-Fetching) است تا بتواند به صورت هوشمندانه، لحظه‌ای و پایدار به سوالات عمومی، تحلیل‌های تکنیکال و داده‌های درون زنجیره‌ای (On-Chain) پاسخ دهد. همچنین در بخش فرانت‌اند، از فریم‌ورک Astro برای پیاده‌سازی یک رابط کاربری مدرن، تاریک و راست‌چین استفاده شده است.</w:t>
       </w:r>
     </w:p>
     <w:p>
       <w:pPr>
         <w:pStyle w:val="Heading1"/>
+        <w:spacing w:before="360" w:after="160"/>
+        <w:jc w:val="right"/>
+        <w:bidi w:val="1"/>
+        <w:outlineLvl w:val="0"/>
+        <w:keepNext/>
+      </w:pPr>
+      <w:r>
+        <w:rPr>
+          <w:rFonts w:ascii="Vazirmatn" w:hAnsi="Vazirmatn"/>
+          <w:b/>
+          <w:color w:val="E91E63"/>
+          <w:sz w:val="36"/>
+          <w:rtl w:val="1"/>
+          <w:rFonts w:ascii="Vazirmatn" w:hAnsi="Vazirmatn" w:cs="Vazirmatn" w:eastAsia="Vazirmatn"/>
+          <w:color w:val="E91E63"/>
+        </w:rPr>
+        <w:t>۲. معماری کلی سیستم</w:t>
+      </w:r>
+    </w:p>
+    <w:p>
+      <w:pPr>
+        <w:spacing w:line="300" w:lineRule="auto" w:after="160"/>
         <w:jc w:val="right"/>
         <w:bidi w:val="1"/>
       </w:pPr>
       <w:r>
         <w:rPr>
           <w:rFonts w:ascii="Vazirmatn" w:hAnsi="Vazirmatn"/>
+          <w:color w:val="212529"/>
+          <w:sz w:val="22"/>
           <w:rtl w:val="1"/>
           <w:rFonts w:ascii="Vazirmatn" w:hAnsi="Vazirmatn" w:cs="Vazirmatn" w:eastAsia="Vazirmatn"/>
-        </w:rPr>
-        <w:t>۲. معماری کلی سیستم</w:t>
-      </w:r>
-    </w:p>
-    <w:p>
-      <w:pPr>
-        <w:jc w:val="right"/>
-        <w:bidi w:val="1"/>
-        <w:bidi w:val="1"/>
-      </w:pPr>
-      <w:r/>
-      <w:r>
-        <w:rPr>
-          <w:rFonts w:ascii="Vazirmatn" w:hAnsi="Vazirmatn"/>
-          <w:rtl w:val="1"/>
-          <w:rFonts w:ascii="Vazirmatn" w:hAnsi="Vazirmatn" w:cs="Vazirmatn" w:eastAsia="Vazirmatn"/>
+          <w:color w:val="212529"/>
         </w:rPr>
         <w:t>سیستم از دو بخش اصلی تشکیل شده است: یک بک‌اند قدرتمند مبتنی بر پایتون، جنگو و فریم‌ورک Agno متصل به پایگاه داده PostgreSQL و Redis، و یک فرانت‌اند سریع و مدرن بر پایه Astro. این سیستم در ابتدا جهت ارائه خدمات تحلیلی هوشمند به کاربران سامانه parsiancrpto.com طراحی و آماده‌سازی گردید. ارتباط بین این دو بخش از طریق APIهای RESTful (به طور خاص مسیر /api/chat) صورت می‌گیرد. درخواست‌های کاربر دریافت شده، داده‌های متصل شده (در صورت وجود) پردازش شده و پس از ذخیره‌سازی و مدیریت در پایگاه داده، به ایجنت‌های مربوطه جهت تولید پاسخ تحویل داده می‌شوند.</w:t>
       </w:r>
@@ -399,181 +489,960 @@
     <w:p>
       <w:pPr>
         <w:pStyle w:val="Heading1"/>
+        <w:spacing w:before="360" w:after="160"/>
+        <w:jc w:val="right"/>
+        <w:bidi w:val="1"/>
+        <w:outlineLvl w:val="0"/>
+        <w:keepNext/>
+      </w:pPr>
+      <w:r>
+        <w:rPr>
+          <w:rFonts w:ascii="Vazirmatn" w:hAnsi="Vazirmatn"/>
+          <w:b/>
+          <w:color w:val="E91E63"/>
+          <w:sz w:val="36"/>
+          <w:rtl w:val="1"/>
+          <w:rFonts w:ascii="Vazirmatn" w:hAnsi="Vazirmatn" w:cs="Vazirmatn" w:eastAsia="Vazirmatn"/>
+          <w:color w:val="E91E63"/>
+        </w:rPr>
+        <w:t>۳. معماری بک‌اند و هوش مصنوعی (Agno Framework)</w:t>
+      </w:r>
+    </w:p>
+    <w:p>
+      <w:pPr>
+        <w:spacing w:line="300" w:lineRule="auto" w:after="160"/>
         <w:jc w:val="right"/>
         <w:bidi w:val="1"/>
       </w:pPr>
       <w:r>
         <w:rPr>
           <w:rFonts w:ascii="Vazirmatn" w:hAnsi="Vazirmatn"/>
+          <w:color w:val="212529"/>
+          <w:sz w:val="22"/>
           <w:rtl w:val="1"/>
           <w:rFonts w:ascii="Vazirmatn" w:hAnsi="Vazirmatn" w:cs="Vazirmatn" w:eastAsia="Vazirmatn"/>
+          <w:color w:val="212529"/>
         </w:rPr>
-        <w:t>۳. معماری بک‌اند و هوش مصنوعی (Agno Framework)</w:t>
+        <w:t>هسته هوش مصنوعی این پروژه به جای استفاده از روش‌های ساده و یکپارچه، از رویکرد ایجنت‌محور با بهره‌گیری از فریم‌ورک Agno نسخه 2.1.4 استفاده می‌کند. این روش باعث می‌شود تا وظایف پیچیده تحلیلی شکسته شده و به ایجنت‌های تخصصی واگذار شوند. ساختار کلی لایه‌های بک‌اند، ابزارهای اجرایی (ToolKits) و لایه مدل‌های زبانی در نمودار زیر نشان داده شده است:</w:t>
       </w:r>
     </w:p>
     <w:p>
       <w:pPr>
+        <w:spacing w:before="240" w:after="80"/>
+        <w:jc w:val="center"/>
+        <w:bidi w:val="1"/>
+      </w:pPr>
+      <w:r>
+        <w:drawing>
+          <wp:inline xmlns:a="http://schemas.openxmlformats.org/drawingml/2006/main" xmlns:pic="http://schemas.openxmlformats.org/drawingml/2006/picture">
+            <wp:extent cx="5669280" cy="4445694"/>
+            <wp:docPr id="1" name="Picture 1"/>
+            <wp:cNvGraphicFramePr>
+              <a:graphicFrameLocks noChangeAspect="1"/>
+            </wp:cNvGraphicFramePr>
+            <a:graphic>
+              <a:graphicData uri="http://schemas.openxmlformats.org/drawingml/2006/picture">
+                <pic:pic>
+                  <pic:nvPicPr>
+                    <pic:cNvPr id="0" name="backend_architecture_diagram.png"/>
+                    <pic:cNvPicPr/>
+                  </pic:nvPicPr>
+                  <pic:blipFill>
+                    <a:blip r:embed="rId9"/>
+                    <a:stretch>
+                      <a:fillRect/>
+                    </a:stretch>
+                  </pic:blipFill>
+                  <pic:spPr>
+                    <a:xfrm>
+                      <a:off x="0" y="0"/>
+                      <a:ext cx="5669280" cy="4445694"/>
+                    </a:xfrm>
+                    <a:prstGeom prst="rect"/>
+                  </pic:spPr>
+                </pic:pic>
+              </a:graphicData>
+            </a:graphic>
+          </wp:inline>
+        </w:drawing>
+      </w:r>
+    </w:p>
+    <w:p>
+      <w:pPr>
+        <w:spacing w:after="280"/>
+        <w:jc w:val="center"/>
+        <w:bidi w:val="1"/>
+      </w:pPr>
+      <w:r>
+        <w:rPr>
+          <w:rFonts w:ascii="Vazirmatn" w:hAnsi="Vazirmatn"/>
+          <w:b/>
+          <w:color w:val="64748B"/>
+          <w:sz w:val="19"/>
+          <w:rtl w:val="1"/>
+          <w:rFonts w:ascii="Vazirmatn" w:hAnsi="Vazirmatn" w:cs="Vazirmatn" w:eastAsia="Vazirmatn"/>
+        </w:rPr>
+        <w:t>شکل ۳-۱: نمودار معماری سلسله‌مراتبی لایه‌های بک‌اند، ایجنت‌های تخصصی Agno، ابزارها (ToolKits) و لایه محاسبه قیمت مدل‌های زبانی</w:t>
+      </w:r>
+    </w:p>
+    <w:p>
+      <w:pPr>
+        <w:pStyle w:val="Heading2"/>
+        <w:spacing w:before="280" w:after="120"/>
+        <w:jc w:val="right"/>
+        <w:bidi w:val="1"/>
+        <w:outlineLvl w:val="1"/>
+        <w:keepNext/>
+      </w:pPr>
+      <w:r>
+        <w:rPr>
+          <w:rFonts w:ascii="Vazirmatn" w:hAnsi="Vazirmatn"/>
+          <w:b/>
+          <w:color w:val="C2185B"/>
+          <w:sz w:val="30"/>
+          <w:rtl w:val="1"/>
+          <w:rFonts w:ascii="Vazirmatn" w:hAnsi="Vazirmatn" w:cs="Vazirmatn" w:eastAsia="Vazirmatn"/>
+          <w:color w:val="C2185B"/>
+        </w:rPr>
+        <w:t>۳.۱. ایجنت‌های هوشمند (Agno Agents)</w:t>
+      </w:r>
+    </w:p>
+    <w:p>
+      <w:pPr>
+        <w:spacing w:line="300" w:lineRule="auto" w:after="160"/>
         <w:jc w:val="right"/>
         <w:bidi w:val="1"/>
       </w:pPr>
       <w:r>
         <w:rPr>
           <w:rFonts w:ascii="Vazirmatn" w:hAnsi="Vazirmatn"/>
+          <w:color w:val="212529"/>
+          <w:sz w:val="22"/>
           <w:rtl w:val="1"/>
           <w:rFonts w:ascii="Vazirmatn" w:hAnsi="Vazirmatn" w:cs="Vazirmatn" w:eastAsia="Vazirmatn"/>
+          <w:color w:val="212529"/>
         </w:rPr>
-        <w:t>هسته هوش مصنوعی این پروژه به جای استفاده از روش‌های ساده و یکپارچه، از رویکرد ایجنت‌محور با بهره‌گیری از فریم‌ورک Agno نسخه 2.1.4 استفاده می‌کند. این روش باعث می‌شود تا وظایف پیچیده تحلیلی شکسته شده و به ایجنت‌های تخصصی واگذار شوند.</w:t>
+        <w:t>در این سیستم چندین ایجنت تخصصی برای انجام وظایف تحلیلی و پردازشی تعریف شده است:</w:t>
       </w:r>
     </w:p>
     <w:p>
       <w:pPr>
-        <w:pStyle w:val="Heading2"/>
+        <w:pStyle w:val="Heading3"/>
+        <w:spacing w:before="200" w:after="80"/>
+        <w:jc w:val="right"/>
+        <w:bidi w:val="1"/>
+        <w:outlineLvl w:val="2"/>
+        <w:keepNext/>
+      </w:pPr>
+      <w:r>
+        <w:rPr>
+          <w:rFonts w:ascii="Vazirmatn" w:hAnsi="Vazirmatn"/>
+          <w:b/>
+          <w:color w:val="6A1B9A"/>
+          <w:sz w:val="26"/>
+          <w:rtl w:val="1"/>
+          <w:rFonts w:ascii="Vazirmatn" w:hAnsi="Vazirmatn" w:cs="Vazirmatn" w:eastAsia="Vazirmatn"/>
+          <w:color w:val="6A1B9A"/>
+        </w:rPr>
+        <w:t>۳.۱.۱. ایجنت تحلیل تکنیکال (Technical Agent)</w:t>
+      </w:r>
+    </w:p>
+    <w:p>
+      <w:pPr>
+        <w:spacing w:line="300" w:lineRule="auto" w:after="160"/>
         <w:jc w:val="right"/>
         <w:bidi w:val="1"/>
       </w:pPr>
       <w:r>
         <w:rPr>
           <w:rFonts w:ascii="Vazirmatn" w:hAnsi="Vazirmatn"/>
+          <w:color w:val="212529"/>
+          <w:sz w:val="22"/>
           <w:rtl w:val="1"/>
           <w:rFonts w:ascii="Vazirmatn" w:hAnsi="Vazirmatn" w:cs="Vazirmatn" w:eastAsia="Vazirmatn"/>
+          <w:color w:val="212529"/>
         </w:rPr>
-        <w:t>۳.۱. ایجنت‌های هوشمند (Agno Agents)</w:t>
+        <w:t>متخصص تحلیل نمودارها، کندل‌های OHLCV و اندیکاتورهای فنی (مانند RSI, MACD, Aroon, CCI). این ایجنت با دریافت داده‌های سری زمانی، وضعیت بازار را تحلیل کرده و سیگنال‌های دقیق معاملاتی صادر می‌نماید.</w:t>
       </w:r>
     </w:p>
     <w:p>
       <w:pPr>
+        <w:pStyle w:val="Heading3"/>
+        <w:spacing w:before="200" w:after="80"/>
+        <w:jc w:val="right"/>
+        <w:bidi w:val="1"/>
+        <w:outlineLvl w:val="2"/>
+        <w:keepNext/>
+      </w:pPr>
+      <w:r>
+        <w:rPr>
+          <w:rFonts w:ascii="Vazirmatn" w:hAnsi="Vazirmatn"/>
+          <w:b/>
+          <w:color w:val="6A1B9A"/>
+          <w:sz w:val="26"/>
+          <w:rtl w:val="1"/>
+          <w:rFonts w:ascii="Vazirmatn" w:hAnsi="Vazirmatn" w:cs="Vazirmatn" w:eastAsia="Vazirmatn"/>
+          <w:color w:val="6A1B9A"/>
+        </w:rPr>
+        <w:t>۳.۱.۲. ایجنت بنیادی و آن‌چین (Fundamental Agent)</w:t>
+      </w:r>
+    </w:p>
+    <w:p>
+      <w:pPr>
+        <w:spacing w:line="300" w:lineRule="auto" w:after="160"/>
         <w:jc w:val="right"/>
         <w:bidi w:val="1"/>
       </w:pPr>
       <w:r>
         <w:rPr>
           <w:rFonts w:ascii="Vazirmatn" w:hAnsi="Vazirmatn"/>
+          <w:color w:val="212529"/>
+          <w:sz w:val="22"/>
           <w:rtl w:val="1"/>
           <w:rFonts w:ascii="Vazirmatn" w:hAnsi="Vazirmatn" w:cs="Vazirmatn" w:eastAsia="Vazirmatn"/>
+          <w:color w:val="212529"/>
         </w:rPr>
-        <w:t>در این سیستم چندین ایجنت تخصصی تعریف شده است:</w:t>
-        <w:br/>
-        <w:t>- Technical Agent: متخصص تحلیل نمودارها، کندل‌ها و اندیکاتورها (مانند RSI, MACD, Aroon). این ایجنت با دریافت داده‌های سری زمانی، وضعیت بازار را تحلیل کرده و سیگنال ارائه می‌دهد.</w:t>
-        <w:br/>
-        <w:t>- Fundamental Agent: متخصص بررسی داده‌های آن‌چین (On-Chain) مانند جریان پول هوشمند (Smart Money Flow) و رفتار ماینرها.</w:t>
-        <w:br/>
-        <w:t>- Code Agent: ایجنت برنامه‌نویس برای تولید اسکریپت‌های تحلیلی پایتون (مثلاً با Pandas) جهت محاسبه اندیکاتورها.</w:t>
-        <w:br/>
-        <w:t>- Reactive Agent Web: ایجنت عمومی با قابلیت جستجو در وب (از طریق DuckDuckGo) برای پاسخ به سوالات عمومی و اخبار کریپتو.</w:t>
+        <w:t>متخصص بررسی داده‌های درون زنجیره‌ای (On-Chain)، شاخص‌های جریان پول هوشمند (Smart Money Flow)، خالص جریان صرافی‌ها (Exchange Netflow) و تحلیل رفتار ماینرها.</w:t>
       </w:r>
     </w:p>
     <w:p>
       <w:pPr>
-        <w:pStyle w:val="Heading2"/>
+        <w:pStyle w:val="Heading3"/>
+        <w:spacing w:before="200" w:after="80"/>
+        <w:jc w:val="right"/>
+        <w:bidi w:val="1"/>
+        <w:outlineLvl w:val="2"/>
+        <w:keepNext/>
+      </w:pPr>
+      <w:r>
+        <w:rPr>
+          <w:rFonts w:ascii="Vazirmatn" w:hAnsi="Vazirmatn"/>
+          <w:b/>
+          <w:color w:val="6A1B9A"/>
+          <w:sz w:val="26"/>
+          <w:rtl w:val="1"/>
+          <w:rFonts w:ascii="Vazirmatn" w:hAnsi="Vazirmatn" w:cs="Vazirmatn" w:eastAsia="Vazirmatn"/>
+          <w:color w:val="6A1B9A"/>
+        </w:rPr>
+        <w:t>۳.۱.۳. ایجنت برنامه‌نویسی و کد (Code Agent)</w:t>
+      </w:r>
+    </w:p>
+    <w:p>
+      <w:pPr>
+        <w:spacing w:line="300" w:lineRule="auto" w:after="160"/>
         <w:jc w:val="right"/>
         <w:bidi w:val="1"/>
       </w:pPr>
       <w:r>
         <w:rPr>
           <w:rFonts w:ascii="Vazirmatn" w:hAnsi="Vazirmatn"/>
+          <w:color w:val="212529"/>
+          <w:sz w:val="22"/>
           <w:rtl w:val="1"/>
           <w:rFonts w:ascii="Vazirmatn" w:hAnsi="Vazirmatn" w:cs="Vazirmatn" w:eastAsia="Vazirmatn"/>
+          <w:color w:val="212529"/>
+        </w:rPr>
+        <w:t>ایجنت برنامه‌نویس جهت تولید اسکریپت‌های تحلیلی پایتون (با استفاده از کتابخانه Pandas) برای محاسبه فرمول‌های پیچیده اندیکاتورها و پردازش داده‌ها.</w:t>
+      </w:r>
+    </w:p>
+    <w:p>
+      <w:pPr>
+        <w:pStyle w:val="Heading3"/>
+        <w:spacing w:before="200" w:after="80"/>
+        <w:jc w:val="right"/>
+        <w:bidi w:val="1"/>
+        <w:outlineLvl w:val="2"/>
+        <w:keepNext/>
+      </w:pPr>
+      <w:r>
+        <w:rPr>
+          <w:rFonts w:ascii="Vazirmatn" w:hAnsi="Vazirmatn"/>
+          <w:b/>
+          <w:color w:val="6A1B9A"/>
+          <w:sz w:val="26"/>
+          <w:rtl w:val="1"/>
+          <w:rFonts w:ascii="Vazirmatn" w:hAnsi="Vazirmatn" w:cs="Vazirmatn" w:eastAsia="Vazirmatn"/>
+          <w:color w:val="6A1B9A"/>
+        </w:rPr>
+        <w:t>۳.۱.۴. ایجنت عمومی و وب (Reactive Agent)</w:t>
+      </w:r>
+    </w:p>
+    <w:p>
+      <w:pPr>
+        <w:spacing w:line="300" w:lineRule="auto" w:after="160"/>
+        <w:jc w:val="right"/>
+        <w:bidi w:val="1"/>
+      </w:pPr>
+      <w:r>
+        <w:rPr>
+          <w:rFonts w:ascii="Vazirmatn" w:hAnsi="Vazirmatn"/>
+          <w:color w:val="212529"/>
+          <w:sz w:val="22"/>
+          <w:rtl w:val="1"/>
+          <w:rFonts w:ascii="Vazirmatn" w:hAnsi="Vazirmatn" w:cs="Vazirmatn" w:eastAsia="Vazirmatn"/>
+          <w:color w:val="212529"/>
+        </w:rPr>
+        <w:t>ایجنت عمومی با قابلیت جستجوی مستقیم در وب (از طریق موتور جستجوی DuckDuckGo) برای پاسخ به سوالات عمومی، احوال‌پرسی‌ها و استخراج اخبار کریپتو.</w:t>
+      </w:r>
+    </w:p>
+    <w:p>
+      <w:pPr>
+        <w:pStyle w:val="Heading2"/>
+        <w:spacing w:before="280" w:after="120"/>
+        <w:jc w:val="right"/>
+        <w:bidi w:val="1"/>
+        <w:outlineLvl w:val="1"/>
+        <w:keepNext/>
+      </w:pPr>
+      <w:r>
+        <w:rPr>
+          <w:rFonts w:ascii="Vazirmatn" w:hAnsi="Vazirmatn"/>
+          <w:b/>
+          <w:color w:val="C2185B"/>
+          <w:sz w:val="30"/>
+          <w:rtl w:val="1"/>
+          <w:rFonts w:ascii="Vazirmatn" w:hAnsi="Vazirmatn" w:cs="Vazirmatn" w:eastAsia="Vazirmatn"/>
+          <w:color w:val="C2185B"/>
         </w:rPr>
         <w:t>۳.۲. ابزارهای تحلیلی (ToolKits)</w:t>
       </w:r>
     </w:p>
     <w:p>
       <w:pPr>
+        <w:spacing w:line="300" w:lineRule="auto" w:after="160"/>
         <w:jc w:val="right"/>
         <w:bidi w:val="1"/>
       </w:pPr>
       <w:r>
         <w:rPr>
           <w:rFonts w:ascii="Vazirmatn" w:hAnsi="Vazirmatn"/>
+          <w:color w:val="212529"/>
+          <w:sz w:val="22"/>
           <w:rtl w:val="1"/>
           <w:rFonts w:ascii="Vazirmatn" w:hAnsi="Vazirmatn" w:cs="Vazirmatn" w:eastAsia="Vazirmatn"/>
+          <w:color w:val="212529"/>
         </w:rPr>
-        <w:t>هر ایجنت برای انجام وظایف خود به مجموعه‌ای از ابزارها دسترسی دارد. این ابزارها در قالب ToolKit توسعه داده شده‌اند:</w:t>
-        <w:br/>
-        <w:t>- TAToolKit: شامل توابعی مانند get_chart_summary، get_recent_candles و get_indicator_data که داده‌های خام را برای ایجنت تکنیکال پردازش می‌کنند.</w:t>
-        <w:br/>
-        <w:t>- FundamentalToolKit: شامل توابعی مانند get_fundamental_summary و get_metric_data که برای تحلیل جریان‌های ورودی و خروجی صرافی‌ها و رفتار ماینرها استفاده می‌شوند.</w:t>
-        <w:br/>
-        <w:t>- WebTools: دسترسی به موتور جستجوی وب برای استخراج اطلاعات بلادرنگ.</w:t>
+        <w:t>هر ایجنت برای انجام وظایف خود به مجموعه‌ای از ابزارهای تخصصی (ToolKits) دسترسی دارد:</w:t>
       </w:r>
     </w:p>
     <w:p>
       <w:pPr>
-        <w:pStyle w:val="Heading2"/>
+        <w:pStyle w:val="Heading3"/>
+        <w:spacing w:before="200" w:after="80"/>
+        <w:jc w:val="right"/>
+        <w:bidi w:val="1"/>
+        <w:outlineLvl w:val="2"/>
+        <w:keepNext/>
+      </w:pPr>
+      <w:r>
+        <w:rPr>
+          <w:rFonts w:ascii="Vazirmatn" w:hAnsi="Vazirmatn"/>
+          <w:b/>
+          <w:color w:val="6A1B9A"/>
+          <w:sz w:val="26"/>
+          <w:rtl w:val="1"/>
+          <w:rFonts w:ascii="Vazirmatn" w:hAnsi="Vazirmatn" w:cs="Vazirmatn" w:eastAsia="Vazirmatn"/>
+          <w:color w:val="6A1B9A"/>
+        </w:rPr>
+        <w:t>۳.۲.۱. ابزار تحلیل تکنیکال (TAToolKit)</w:t>
+      </w:r>
+    </w:p>
+    <w:p>
+      <w:pPr>
+        <w:spacing w:line="300" w:lineRule="auto" w:after="160"/>
         <w:jc w:val="right"/>
         <w:bidi w:val="1"/>
       </w:pPr>
       <w:r>
         <w:rPr>
           <w:rFonts w:ascii="Vazirmatn" w:hAnsi="Vazirmatn"/>
+          <w:color w:val="212529"/>
+          <w:sz w:val="22"/>
           <w:rtl w:val="1"/>
           <w:rFonts w:ascii="Vazirmatn" w:hAnsi="Vazirmatn" w:cs="Vazirmatn" w:eastAsia="Vazirmatn"/>
+          <w:color w:val="212529"/>
+        </w:rPr>
+        <w:t>شامل توابعی نظیر get_chart_summary، get_recent_candles و get_indicator_data که داده‌های خام کندل‌ها و اندیکاتورها را جهت استفاده ایجنت تکنیکال پردازش می‌کنند.</w:t>
+      </w:r>
+    </w:p>
+    <w:p>
+      <w:pPr>
+        <w:pStyle w:val="Heading3"/>
+        <w:spacing w:before="200" w:after="80"/>
+        <w:jc w:val="right"/>
+        <w:bidi w:val="1"/>
+        <w:outlineLvl w:val="2"/>
+        <w:keepNext/>
+      </w:pPr>
+      <w:r>
+        <w:rPr>
+          <w:rFonts w:ascii="Vazirmatn" w:hAnsi="Vazirmatn"/>
+          <w:b/>
+          <w:color w:val="6A1B9A"/>
+          <w:sz w:val="26"/>
+          <w:rtl w:val="1"/>
+          <w:rFonts w:ascii="Vazirmatn" w:hAnsi="Vazirmatn" w:cs="Vazirmatn" w:eastAsia="Vazirmatn"/>
+          <w:color w:val="6A1B9A"/>
+        </w:rPr>
+        <w:t>۳.۲.۲. ابزار داده‌های بنیادی (FundamentalToolKit)</w:t>
+      </w:r>
+    </w:p>
+    <w:p>
+      <w:pPr>
+        <w:spacing w:line="300" w:lineRule="auto" w:after="160"/>
+        <w:jc w:val="right"/>
+        <w:bidi w:val="1"/>
+      </w:pPr>
+      <w:r>
+        <w:rPr>
+          <w:rFonts w:ascii="Vazirmatn" w:hAnsi="Vazirmatn"/>
+          <w:color w:val="212529"/>
+          <w:sz w:val="22"/>
+          <w:rtl w:val="1"/>
+          <w:rFonts w:ascii="Vazirmatn" w:hAnsi="Vazirmatn" w:cs="Vazirmatn" w:eastAsia="Vazirmatn"/>
+          <w:color w:val="212529"/>
+        </w:rPr>
+        <w:t>شامل توابعی مانند get_fundamental_summary و get_metric_data که جهت تحلیل جریان ورودی/خروجی صرافی‌ها و رفتار ماینرها به کار می‌روند.</w:t>
+      </w:r>
+    </w:p>
+    <w:p>
+      <w:pPr>
+        <w:pStyle w:val="Heading3"/>
+        <w:spacing w:before="200" w:after="80"/>
+        <w:jc w:val="right"/>
+        <w:bidi w:val="1"/>
+        <w:outlineLvl w:val="2"/>
+        <w:keepNext/>
+      </w:pPr>
+      <w:r>
+        <w:rPr>
+          <w:rFonts w:ascii="Vazirmatn" w:hAnsi="Vazirmatn"/>
+          <w:b/>
+          <w:color w:val="6A1B9A"/>
+          <w:sz w:val="26"/>
+          <w:rtl w:val="1"/>
+          <w:rFonts w:ascii="Vazirmatn" w:hAnsi="Vazirmatn" w:cs="Vazirmatn" w:eastAsia="Vazirmatn"/>
+          <w:color w:val="6A1B9A"/>
+        </w:rPr>
+        <w:t>۳.۲.۳. ابزارهای جستجوی وب (WebTools)</w:t>
+      </w:r>
+    </w:p>
+    <w:p>
+      <w:pPr>
+        <w:spacing w:line="300" w:lineRule="auto" w:after="160"/>
+        <w:jc w:val="right"/>
+        <w:bidi w:val="1"/>
+      </w:pPr>
+      <w:r>
+        <w:rPr>
+          <w:rFonts w:ascii="Vazirmatn" w:hAnsi="Vazirmatn"/>
+          <w:color w:val="212529"/>
+          <w:sz w:val="22"/>
+          <w:rtl w:val="1"/>
+          <w:rFonts w:ascii="Vazirmatn" w:hAnsi="Vazirmatn" w:cs="Vazirmatn" w:eastAsia="Vazirmatn"/>
+          <w:color w:val="212529"/>
+        </w:rPr>
+        <w:t>دسترس‌پذیری به موتور جستجوی وب جهت استخراج اطلاعات بلادرنگ و اخبار روز کریپتو.</w:t>
+      </w:r>
+    </w:p>
+    <w:p>
+      <w:pPr>
+        <w:pStyle w:val="Heading2"/>
+        <w:spacing w:before="280" w:after="120"/>
+        <w:jc w:val="right"/>
+        <w:bidi w:val="1"/>
+        <w:outlineLvl w:val="1"/>
+        <w:keepNext/>
+      </w:pPr>
+      <w:r>
+        <w:rPr>
+          <w:rFonts w:ascii="Vazirmatn" w:hAnsi="Vazirmatn"/>
+          <w:b/>
+          <w:color w:val="C2185B"/>
+          <w:sz w:val="30"/>
+          <w:rtl w:val="1"/>
+          <w:rFonts w:ascii="Vazirmatn" w:hAnsi="Vazirmatn" w:cs="Vazirmatn" w:eastAsia="Vazirmatn"/>
+          <w:color w:val="C2185B"/>
         </w:rPr>
         <w:t>۳.۳. هماهنگ‌کننده و مسیریابی (Orchestrator)</w:t>
       </w:r>
     </w:p>
     <w:p>
       <w:pPr>
+        <w:spacing w:line="300" w:lineRule="auto" w:after="160"/>
         <w:jc w:val="right"/>
         <w:bidi w:val="1"/>
       </w:pPr>
       <w:r>
         <w:rPr>
           <w:rFonts w:ascii="Vazirmatn" w:hAnsi="Vazirmatn"/>
+          <w:color w:val="212529"/>
+          <w:sz w:val="22"/>
           <w:rtl w:val="1"/>
           <w:rFonts w:ascii="Vazirmatn" w:hAnsi="Vazirmatn" w:cs="Vazirmatn" w:eastAsia="Vazirmatn"/>
+          <w:color w:val="212529"/>
         </w:rPr>
-        <w:t>کامپوننت orchestrator.py وظیفه مسیریابی (Routing) درخواست‌ها را بر عهده دارد. تابع run_agno_chat با بررسی payload ورودی (مثلاً وجود کلید analysis یا analysis_fundamental) درخواست کاربر را به ایجنت مناسب هدایت می‌کند. همچنین این بخش وظیفه محاسبه دقیق توکن‌های مصرفی و هزینه نهایی پردازش را با توجه به مدل انتخاب شده (مانند gpt-4o, gpt-4.5-preview, o1) انجام می‌دهد.</w:t>
+        <w:t>کامپوننت orchestrator.py وظیفه مسیریابی (Routing) هوشمند درخواست‌ها را بر عهده دارد. تابع run_agno_chat با بررسی دقیق متن پرسش و دیتاسِت‌های ورودی، درخواست کاربر را به ایجنت تخصصی مربوطه (Technical, Fundamental, Code یا Reactive) هدایت می‌کند. در این لایه، گام‌های روند تفکر ایجنت (Thinking Process) به صورت شفاف استخراج شده و محاسبه دقیق توکن‌های مصرفی و قیمت نهایی پردازش به دلار (مانند $0.000080 برای gpt-4o-mini) بر اساس فرمول‌های قیمت‌گذاری مدل انجام می‌پذیرد.</w:t>
       </w:r>
     </w:p>
     <w:p>
       <w:pPr>
         <w:pStyle w:val="Heading2"/>
+        <w:spacing w:before="280" w:after="120"/>
+        <w:jc w:val="right"/>
+        <w:bidi w:val="1"/>
+        <w:outlineLvl w:val="1"/>
+        <w:keepNext/>
+      </w:pPr>
+      <w:r>
+        <w:rPr>
+          <w:rFonts w:ascii="Vazirmatn" w:hAnsi="Vazirmatn"/>
+          <w:b/>
+          <w:color w:val="C2185B"/>
+          <w:sz w:val="30"/>
+          <w:rtl w:val="1"/>
+          <w:rFonts w:ascii="Vazirmatn" w:hAnsi="Vazirmatn" w:cs="Vazirmatn" w:eastAsia="Vazirmatn"/>
+          <w:color w:val="C2185B"/>
+        </w:rPr>
+        <w:t>۳.۴. پایگاه داده و ذخیره‌سازی داده‌ها (PostgreSQL &amp; Redis)</w:t>
+      </w:r>
+    </w:p>
+    <w:p>
+      <w:pPr>
+        <w:spacing w:line="300" w:lineRule="auto" w:after="160"/>
         <w:jc w:val="right"/>
         <w:bidi w:val="1"/>
       </w:pPr>
       <w:r>
         <w:rPr>
           <w:rFonts w:ascii="Vazirmatn" w:hAnsi="Vazirmatn"/>
+          <w:color w:val="212529"/>
+          <w:sz w:val="22"/>
           <w:rtl w:val="1"/>
           <w:rFonts w:ascii="Vazirmatn" w:hAnsi="Vazirmatn" w:cs="Vazirmatn" w:eastAsia="Vazirmatn"/>
+          <w:color w:val="212529"/>
         </w:rPr>
-        <w:t>۳.۴. پایگاه داده و ذخیره‌سازی داده‌ها (PostgreSQL &amp; Redis)</w:t>
+        <w:t>جهت مدیریت نشست‌های کاری (Conversations)، ذخیره‌سازی پیام‌ها، نگه‌داری متاداده‌های تحلیلی و ثبت بازخوردهای کاربران، بک‌اند سیستم از پایگاه داده رابطه‌ای PostgreSQL به همراه ORM قدرتمند جنگو استفاده می‌کند. مهم‌ترین مدل‌های ذخیره‌سازی طراحی‌شده عبارتند از:</w:t>
       </w:r>
     </w:p>
     <w:p>
       <w:pPr>
+        <w:pStyle w:val="Heading3"/>
+        <w:spacing w:before="200" w:after="80"/>
+        <w:jc w:val="right"/>
+        <w:bidi w:val="1"/>
+        <w:outlineLvl w:val="2"/>
+        <w:keepNext/>
+      </w:pPr>
+      <w:r>
+        <w:rPr>
+          <w:rFonts w:ascii="Vazirmatn" w:hAnsi="Vazirmatn"/>
+          <w:b/>
+          <w:color w:val="6A1B9A"/>
+          <w:sz w:val="26"/>
+          <w:rtl w:val="1"/>
+          <w:rFonts w:ascii="Vazirmatn" w:hAnsi="Vazirmatn" w:cs="Vazirmatn" w:eastAsia="Vazirmatn"/>
+          <w:color w:val="6A1B9A"/>
+        </w:rPr>
+        <w:t>۳.۴.۱. مدل نشست‌ها (Conversation)</w:t>
+      </w:r>
+    </w:p>
+    <w:p>
+      <w:pPr>
+        <w:spacing w:line="300" w:lineRule="auto" w:after="160"/>
         <w:jc w:val="right"/>
         <w:bidi w:val="1"/>
       </w:pPr>
       <w:r>
         <w:rPr>
           <w:rFonts w:ascii="Vazirmatn" w:hAnsi="Vazirmatn"/>
+          <w:color w:val="212529"/>
+          <w:sz w:val="22"/>
           <w:rtl w:val="1"/>
           <w:rFonts w:ascii="Vazirmatn" w:hAnsi="Vazirmatn" w:cs="Vazirmatn" w:eastAsia="Vazirmatn"/>
+          <w:color w:val="212529"/>
         </w:rPr>
-        <w:t>جهت مدیریت نشست‌های کاری (Conversations)، ذخیره‌سازی پیام‌ها و نگه‌داری متاداده‌های تحلیلی، بک‌اند سیستم از پایگاه داده رابطه‌ای PostgreSQL به همراه ORM جنگو بهره می‌برد. مهم‌ترین مدل‌های ذخیره‌سازی شده عبارتند از:</w:t>
-        <w:br/>
-        <w:t>- Conversation: نگه‌داری شناسه یکتای نشست (UUID)، شناسه کاربر (user_id) و وضعیت آرشیو.</w:t>
-        <w:br/>
-        <w:t>- Message: ذخیره‌سازی متن سوال و پاسخ ایجنت، مدل انتخاب‌شده (مانند gpt-4o, o3-mini)، هزینه محاسبه‌شده (price)، سطح استدلال (reasoning)، مدت‌زمان تولید پاسخ (answer_generation_duration) و داده‌های ساختاریافته تکنیکال و بنیادین در قالب JSONField (تحت کلیدهای analysis و analysis_fundamental).</w:t>
-        <w:br/>
-        <w:t>- Feedback &amp; ProblemReport: ثبت بازخوردهای کاربران (لایک/دیس‌لایک) و گزارش مشکلات جهت بهبود مستمر عملکرد سیستم.</w:t>
-        <w:br/>
-        <w:t>همچنین از پایگاه داده کلید-مقدار Redis به عنوان پیام‌رسان (Broker) برای مدیریت وظایف پیش‌زمینه Celery و سیستم لایه میان‌گیر (Caching) استفاده شده است.</w:t>
+        <w:t>نگه‌داری شناسه یکتای نشست (UUID)، شناسه کاربر (user_id)، وضعیت آرشیو (is_archive) و زمان‌بندی ایجاد و به‌روزرسانی.</w:t>
       </w:r>
     </w:p>
     <w:p>
       <w:pPr>
-        <w:pStyle w:val="Heading1"/>
+        <w:pStyle w:val="Heading3"/>
+        <w:spacing w:before="200" w:after="80"/>
+        <w:jc w:val="right"/>
+        <w:bidi w:val="1"/>
+        <w:outlineLvl w:val="2"/>
+        <w:keepNext/>
+      </w:pPr>
+      <w:r>
+        <w:rPr>
+          <w:rFonts w:ascii="Vazirmatn" w:hAnsi="Vazirmatn"/>
+          <w:b/>
+          <w:color w:val="6A1B9A"/>
+          <w:sz w:val="26"/>
+          <w:rtl w:val="1"/>
+          <w:rFonts w:ascii="Vazirmatn" w:hAnsi="Vazirmatn" w:cs="Vazirmatn" w:eastAsia="Vazirmatn"/>
+          <w:color w:val="6A1B9A"/>
+        </w:rPr>
+        <w:t>۳.۴.۲. مدل پیام‌ها (Message)</w:t>
+      </w:r>
+    </w:p>
+    <w:p>
+      <w:pPr>
+        <w:spacing w:line="300" w:lineRule="auto" w:after="160"/>
         <w:jc w:val="right"/>
         <w:bidi w:val="1"/>
       </w:pPr>
       <w:r>
         <w:rPr>
           <w:rFonts w:ascii="Vazirmatn" w:hAnsi="Vazirmatn"/>
+          <w:color w:val="212529"/>
+          <w:sz w:val="22"/>
           <w:rtl w:val="1"/>
           <w:rFonts w:ascii="Vazirmatn" w:hAnsi="Vazirmatn" w:cs="Vazirmatn" w:eastAsia="Vazirmatn"/>
+          <w:color w:val="212529"/>
+        </w:rPr>
+        <w:t>مدل اصلی ذخیره‌سازی پیام‌ها شامل متن پرسش کاربر (question)، پاسخ ایجنت (answer)، قیمت دلار (price)، مدل انتخاب‌شده (gpt-4o, o3-mini)، وضعیت اجرا (status)، سطح استدلال (reasoning)، مدت زمان پاسخ‌دهی و فیلدهای ساختاریافته JSON (تحت عنوان analysis و analysis_fundamental).</w:t>
+      </w:r>
+    </w:p>
+    <w:p>
+      <w:pPr>
+        <w:pStyle w:val="Heading3"/>
+        <w:spacing w:before="200" w:after="80"/>
+        <w:jc w:val="right"/>
+        <w:bidi w:val="1"/>
+        <w:outlineLvl w:val="2"/>
+        <w:keepNext/>
+      </w:pPr>
+      <w:r>
+        <w:rPr>
+          <w:rFonts w:ascii="Vazirmatn" w:hAnsi="Vazirmatn"/>
+          <w:b/>
+          <w:color w:val="6A1B9A"/>
+          <w:sz w:val="26"/>
+          <w:rtl w:val="1"/>
+          <w:rFonts w:ascii="Vazirmatn" w:hAnsi="Vazirmatn" w:cs="Vazirmatn" w:eastAsia="Vazirmatn"/>
+          <w:color w:val="6A1B9A"/>
+        </w:rPr>
+        <w:t>۳.۴.۳. مدل بازخورد کاربران (Feedback)</w:t>
+      </w:r>
+    </w:p>
+    <w:p>
+      <w:pPr>
+        <w:spacing w:line="300" w:lineRule="auto" w:after="160"/>
+        <w:jc w:val="right"/>
+        <w:bidi w:val="1"/>
+      </w:pPr>
+      <w:r>
+        <w:rPr>
+          <w:rFonts w:ascii="Vazirmatn" w:hAnsi="Vazirmatn"/>
+          <w:color w:val="212529"/>
+          <w:sz w:val="22"/>
+          <w:rtl w:val="1"/>
+          <w:rFonts w:ascii="Vazirmatn" w:hAnsi="Vazirmatn" w:cs="Vazirmatn" w:eastAsia="Vazirmatn"/>
+          <w:color w:val="212529"/>
+        </w:rPr>
+        <w:t>ثبت بازخوردهای کیفی کاربران (لایک / دیس‌لایک) به همراه شناسه کاربر و کلید خارجی متصل به پیام جهت سنجش دقیق کیفیت ایجنت‌ها.</w:t>
+      </w:r>
+    </w:p>
+    <w:p>
+      <w:pPr>
+        <w:pStyle w:val="Heading3"/>
+        <w:spacing w:before="200" w:after="80"/>
+        <w:jc w:val="right"/>
+        <w:bidi w:val="1"/>
+        <w:outlineLvl w:val="2"/>
+        <w:keepNext/>
+      </w:pPr>
+      <w:r>
+        <w:rPr>
+          <w:rFonts w:ascii="Vazirmatn" w:hAnsi="Vazirmatn"/>
+          <w:b/>
+          <w:color w:val="6A1B9A"/>
+          <w:sz w:val="26"/>
+          <w:rtl w:val="1"/>
+          <w:rFonts w:ascii="Vazirmatn" w:hAnsi="Vazirmatn" w:cs="Vazirmatn" w:eastAsia="Vazirmatn"/>
+          <w:color w:val="6A1B9A"/>
+        </w:rPr>
+        <w:t>۳.۴.۴. مدل گزارش خطا (ProblemReport)</w:t>
+      </w:r>
+    </w:p>
+    <w:p>
+      <w:pPr>
+        <w:spacing w:line="300" w:lineRule="auto" w:after="160"/>
+        <w:jc w:val="right"/>
+        <w:bidi w:val="1"/>
+      </w:pPr>
+      <w:r>
+        <w:rPr>
+          <w:rFonts w:ascii="Vazirmatn" w:hAnsi="Vazirmatn"/>
+          <w:color w:val="212529"/>
+          <w:sz w:val="22"/>
+          <w:rtl w:val="1"/>
+          <w:rFonts w:ascii="Vazirmatn" w:hAnsi="Vazirmatn" w:cs="Vazirmatn" w:eastAsia="Vazirmatn"/>
+          <w:color w:val="212529"/>
+        </w:rPr>
+        <w:t>سیستم ثبت و پیگیری گزارش خطاهای کاربران به همراه وضعیت بررسی (Open/Close) و پاسخ مدیر سیستم (close_admin_id).</w:t>
+      </w:r>
+    </w:p>
+    <w:p>
+      <w:pPr>
+        <w:pStyle w:val="Heading3"/>
+        <w:spacing w:before="200" w:after="80"/>
+        <w:jc w:val="right"/>
+        <w:bidi w:val="1"/>
+        <w:outlineLvl w:val="2"/>
+        <w:keepNext/>
+      </w:pPr>
+      <w:r>
+        <w:rPr>
+          <w:rFonts w:ascii="Vazirmatn" w:hAnsi="Vazirmatn"/>
+          <w:b/>
+          <w:color w:val="6A1B9A"/>
+          <w:sz w:val="26"/>
+          <w:rtl w:val="1"/>
+          <w:rFonts w:ascii="Vazirmatn" w:hAnsi="Vazirmatn" w:cs="Vazirmatn" w:eastAsia="Vazirmatn"/>
+          <w:color w:val="6A1B9A"/>
+        </w:rPr>
+        <w:t>۳.۴.۵. لایه حافظه پنهان و صف وظایف (Redis)</w:t>
+      </w:r>
+    </w:p>
+    <w:p>
+      <w:pPr>
+        <w:spacing w:line="300" w:lineRule="auto" w:after="160"/>
+        <w:jc w:val="right"/>
+        <w:bidi w:val="1"/>
+      </w:pPr>
+      <w:r>
+        <w:rPr>
+          <w:rFonts w:ascii="Vazirmatn" w:hAnsi="Vazirmatn"/>
+          <w:color w:val="212529"/>
+          <w:sz w:val="22"/>
+          <w:rtl w:val="1"/>
+          <w:rFonts w:ascii="Vazirmatn" w:hAnsi="Vazirmatn" w:cs="Vazirmatn" w:eastAsia="Vazirmatn"/>
+          <w:color w:val="212529"/>
+        </w:rPr>
+        <w:t>پایگاه داده کلید-مقدار Redis به عنوان Broker پیام‌رسان برای مدیریت وظایف پیش‌زمینه (Asynchronous Tasks) و لایه لایه‌بندی حافظه پنهان (Caching) استفاده گردیده است.</w:t>
+      </w:r>
+    </w:p>
+    <w:p>
+      <w:pPr>
+        <w:pStyle w:val="Heading2"/>
+        <w:spacing w:before="280" w:after="120"/>
+        <w:jc w:val="right"/>
+        <w:bidi w:val="1"/>
+        <w:outlineLvl w:val="1"/>
+        <w:keepNext/>
+      </w:pPr>
+      <w:r>
+        <w:rPr>
+          <w:rFonts w:ascii="Vazirmatn" w:hAnsi="Vazirmatn"/>
+          <w:b/>
+          <w:color w:val="C2185B"/>
+          <w:sz w:val="30"/>
+          <w:rtl w:val="1"/>
+          <w:rFonts w:ascii="Vazirmatn" w:hAnsi="Vazirmatn" w:cs="Vazirmatn" w:eastAsia="Vazirmatn"/>
+          <w:color w:val="C2185B"/>
+        </w:rPr>
+        <w:t>۳.۵. مکانیزم دریافت خودکار و زنده داده‌ها (Live Data Auto-Fetching)</w:t>
+      </w:r>
+    </w:p>
+    <w:p>
+      <w:pPr>
+        <w:spacing w:line="300" w:lineRule="auto" w:after="160"/>
+        <w:jc w:val="right"/>
+        <w:bidi w:val="1"/>
+      </w:pPr>
+      <w:r>
+        <w:rPr>
+          <w:rFonts w:ascii="Vazirmatn" w:hAnsi="Vazirmatn"/>
+          <w:color w:val="212529"/>
+          <w:sz w:val="22"/>
+          <w:rtl w:val="1"/>
+          <w:rFonts w:ascii="Vazirmatn" w:hAnsi="Vazirmatn" w:cs="Vazirmatn" w:eastAsia="Vazirmatn"/>
+          <w:color w:val="212529"/>
+        </w:rPr>
+        <w:t>یکی از کلیدی‌ترین قابلیت‌های سیستم، عدم اتکا به داده‌های قدیمی و توانایی دریافت خودکار و لحظه‌ای داده‌های بازار کریپتو (Live Market Data) می‌باشد. گام‌های این مکانیزم به شرح زیر است:</w:t>
+      </w:r>
+    </w:p>
+    <w:p>
+      <w:pPr>
+        <w:pStyle w:val="Heading3"/>
+        <w:spacing w:before="200" w:after="80"/>
+        <w:jc w:val="right"/>
+        <w:bidi w:val="1"/>
+        <w:outlineLvl w:val="2"/>
+        <w:keepNext/>
+      </w:pPr>
+      <w:r>
+        <w:rPr>
+          <w:rFonts w:ascii="Vazirmatn" w:hAnsi="Vazirmatn"/>
+          <w:b/>
+          <w:color w:val="6A1B9A"/>
+          <w:sz w:val="26"/>
+          <w:rtl w:val="1"/>
+          <w:rFonts w:ascii="Vazirmatn" w:hAnsi="Vazirmatn" w:cs="Vazirmatn" w:eastAsia="Vazirmatn"/>
+          <w:color w:val="6A1B9A"/>
+        </w:rPr>
+        <w:t>۳.۵.۱. شناسایی هوشمند حالت تحلیل (Query Intent Detection)</w:t>
+      </w:r>
+    </w:p>
+    <w:p>
+      <w:pPr>
+        <w:spacing w:line="300" w:lineRule="auto" w:after="160"/>
+        <w:jc w:val="right"/>
+        <w:bidi w:val="1"/>
+      </w:pPr>
+      <w:r>
+        <w:rPr>
+          <w:rFonts w:ascii="Vazirmatn" w:hAnsi="Vazirmatn"/>
+          <w:color w:val="212529"/>
+          <w:sz w:val="22"/>
+          <w:rtl w:val="1"/>
+          <w:rFonts w:ascii="Vazirmatn" w:hAnsi="Vazirmatn" w:cs="Vazirmatn" w:eastAsia="Vazirmatn"/>
+          <w:color w:val="212529"/>
+        </w:rPr>
+        <w:t>هنگام طرح پرسش‌های تحلیلی، سرویس MarketDataService کلیدواژه‌های تخصصی تکنیکال (مانند RSI, MACD, کندل، قیمت) و آن‌چین (مانند پول هوشمند، رفتار ماینرها) را بررسی می‌کند.</w:t>
+      </w:r>
+    </w:p>
+    <w:p>
+      <w:pPr>
+        <w:pStyle w:val="Heading3"/>
+        <w:spacing w:before="200" w:after="80"/>
+        <w:jc w:val="right"/>
+        <w:bidi w:val="1"/>
+        <w:outlineLvl w:val="2"/>
+        <w:keepNext/>
+      </w:pPr>
+      <w:r>
+        <w:rPr>
+          <w:rFonts w:ascii="Vazirmatn" w:hAnsi="Vazirmatn"/>
+          <w:b/>
+          <w:color w:val="6A1B9A"/>
+          <w:sz w:val="26"/>
+          <w:rtl w:val="1"/>
+          <w:rFonts w:ascii="Vazirmatn" w:hAnsi="Vazirmatn" w:cs="Vazirmatn" w:eastAsia="Vazirmatn"/>
+          <w:color w:val="6A1B9A"/>
+        </w:rPr>
+        <w:t>۳.۵.۲. فراخوانی APIهای لحظه‌ای (Live Market Data API)</w:t>
+      </w:r>
+    </w:p>
+    <w:p>
+      <w:pPr>
+        <w:spacing w:line="300" w:lineRule="auto" w:after="160"/>
+        <w:jc w:val="right"/>
+        <w:bidi w:val="1"/>
+      </w:pPr>
+      <w:r>
+        <w:rPr>
+          <w:rFonts w:ascii="Vazirmatn" w:hAnsi="Vazirmatn"/>
+          <w:color w:val="212529"/>
+          <w:sz w:val="22"/>
+          <w:rtl w:val="1"/>
+          <w:rFonts w:ascii="Vazirmatn" w:hAnsi="Vazirmatn" w:cs="Vazirmatn" w:eastAsia="Vazirmatn"/>
+          <w:color w:val="212529"/>
+        </w:rPr>
+        <w:t>در صورت نیاز به داده، داده‌های لحظه‌ای قیمت و کندل‌های صرافی Binance (پروتوکل API klines) و شاخص‌های آن‌چین CoinGecko استخراج می‌شوند.</w:t>
+      </w:r>
+    </w:p>
+    <w:p>
+      <w:pPr>
+        <w:pStyle w:val="Heading3"/>
+        <w:spacing w:before="200" w:after="80"/>
+        <w:jc w:val="right"/>
+        <w:bidi w:val="1"/>
+        <w:outlineLvl w:val="2"/>
+        <w:keepNext/>
+      </w:pPr>
+      <w:r>
+        <w:rPr>
+          <w:rFonts w:ascii="Vazirmatn" w:hAnsi="Vazirmatn"/>
+          <w:b/>
+          <w:color w:val="6A1B9A"/>
+          <w:sz w:val="26"/>
+          <w:rtl w:val="1"/>
+          <w:rFonts w:ascii="Vazirmatn" w:hAnsi="Vazirmatn" w:cs="Vazirmatn" w:eastAsia="Vazirmatn"/>
+          <w:color w:val="6A1B9A"/>
+        </w:rPr>
+        <w:t>۳.۵.۳. بهینه‌سازی عدم فراخوانی در گفتگوهای عمومی (General Chat Optimization)</w:t>
+      </w:r>
+    </w:p>
+    <w:p>
+      <w:pPr>
+        <w:spacing w:line="300" w:lineRule="auto" w:after="160"/>
+        <w:jc w:val="right"/>
+        <w:bidi w:val="1"/>
+      </w:pPr>
+      <w:r>
+        <w:rPr>
+          <w:rFonts w:ascii="Vazirmatn" w:hAnsi="Vazirmatn"/>
+          <w:color w:val="212529"/>
+          <w:sz w:val="22"/>
+          <w:rtl w:val="1"/>
+          <w:rFonts w:ascii="Vazirmatn" w:hAnsi="Vazirmatn" w:cs="Vazirmatn" w:eastAsia="Vazirmatn"/>
+          <w:color w:val="212529"/>
+        </w:rPr>
+        <w:t>در نسخه قبلی، عدم کشف کلیدواژه باعث فراخوانی پیش‌فرض داده‌های بیت‌کوین برای پرسش‌های ساده (مانند 'hi' یا 'سلام') می‌شد. با بهینه‌سازی صورت‌گرفته در تابع auto_enrich_payloads و افزودن تست واحد test_auto_enrich_payloads_greeting، برای پیام‌های عمومی هیچ فراخوانی API خارجی انجام نگرفته و پرسش مستقیماً توسط Reactive Agent پاسخ داده می‌شود.</w:t>
+      </w:r>
+    </w:p>
+    <w:p>
+      <w:pPr>
+        <w:pStyle w:val="Heading3"/>
+        <w:spacing w:before="200" w:after="80"/>
+        <w:jc w:val="right"/>
+        <w:bidi w:val="1"/>
+        <w:outlineLvl w:val="2"/>
+        <w:keepNext/>
+      </w:pPr>
+      <w:r>
+        <w:rPr>
+          <w:rFonts w:ascii="Vazirmatn" w:hAnsi="Vazirmatn"/>
+          <w:b/>
+          <w:color w:val="6A1B9A"/>
+          <w:sz w:val="26"/>
+          <w:rtl w:val="1"/>
+          <w:rFonts w:ascii="Vazirmatn" w:hAnsi="Vazirmatn" w:cs="Vazirmatn" w:eastAsia="Vazirmatn"/>
+          <w:color w:val="6A1B9A"/>
+        </w:rPr>
+        <w:t>۳.۵.۴. تزریق به ابزارهای ایجنت (ToolKit Injection)</w:t>
+      </w:r>
+    </w:p>
+    <w:p>
+      <w:pPr>
+        <w:spacing w:line="300" w:lineRule="auto" w:after="160"/>
+        <w:jc w:val="right"/>
+        <w:bidi w:val="1"/>
+      </w:pPr>
+      <w:r>
+        <w:rPr>
+          <w:rFonts w:ascii="Vazirmatn" w:hAnsi="Vazirmatn"/>
+          <w:color w:val="212529"/>
+          <w:sz w:val="22"/>
+          <w:rtl w:val="1"/>
+          <w:rFonts w:ascii="Vazirmatn" w:hAnsi="Vazirmatn" w:cs="Vazirmatn" w:eastAsia="Vazirmatn"/>
+          <w:color w:val="212529"/>
+        </w:rPr>
+        <w:t>داده‌های زنده به صورت ساختاریافته (JSON) به ابزارهای تحلیلی ایجنت تزریق می‌شوند تا ایجنت Agno سطوح حمایت/مقاومت، روند بازار و سیگنال‌های معاملاتی (EP, TP, SL, R:R) را استخراج کند.</w:t>
+      </w:r>
+    </w:p>
+    <w:p>
+      <w:pPr>
+        <w:pStyle w:val="Heading1"/>
+        <w:spacing w:before="360" w:after="160"/>
+        <w:jc w:val="right"/>
+        <w:bidi w:val="1"/>
+        <w:outlineLvl w:val="0"/>
+        <w:keepNext/>
+      </w:pPr>
+      <w:r>
+        <w:rPr>
+          <w:rFonts w:ascii="Vazirmatn" w:hAnsi="Vazirmatn"/>
+          <w:b/>
+          <w:color w:val="E91E63"/>
+          <w:sz w:val="36"/>
+          <w:rtl w:val="1"/>
+          <w:rFonts w:ascii="Vazirmatn" w:hAnsi="Vazirmatn" w:cs="Vazirmatn" w:eastAsia="Vazirmatn"/>
+          <w:color w:val="E91E63"/>
         </w:rPr>
         <w:t>۴. معماری فرانت‌اند</w:t>
       </w:r>
@@ -581,28 +1450,39 @@
     <w:p>
       <w:pPr>
         <w:pStyle w:val="Heading2"/>
+        <w:spacing w:before="280" w:after="120"/>
+        <w:jc w:val="right"/>
+        <w:bidi w:val="1"/>
+        <w:outlineLvl w:val="1"/>
+        <w:keepNext/>
+      </w:pPr>
+      <w:r>
+        <w:rPr>
+          <w:rFonts w:ascii="Vazirmatn" w:hAnsi="Vazirmatn"/>
+          <w:b/>
+          <w:color w:val="C2185B"/>
+          <w:sz w:val="30"/>
+          <w:rtl w:val="1"/>
+          <w:rFonts w:ascii="Vazirmatn" w:hAnsi="Vazirmatn" w:cs="Vazirmatn" w:eastAsia="Vazirmatn"/>
+          <w:color w:val="C2185B"/>
+        </w:rPr>
+        <w:t>۴.۱. پشته فناوری (Tech Stack)</w:t>
+      </w:r>
+    </w:p>
+    <w:p>
+      <w:pPr>
+        <w:spacing w:line="300" w:lineRule="auto" w:after="160"/>
         <w:jc w:val="right"/>
         <w:bidi w:val="1"/>
       </w:pPr>
       <w:r>
         <w:rPr>
           <w:rFonts w:ascii="Vazirmatn" w:hAnsi="Vazirmatn"/>
+          <w:color w:val="212529"/>
+          <w:sz w:val="22"/>
           <w:rtl w:val="1"/>
           <w:rFonts w:ascii="Vazirmatn" w:hAnsi="Vazirmatn" w:cs="Vazirmatn" w:eastAsia="Vazirmatn"/>
-        </w:rPr>
-        <w:t>۴.۱. پشته فناوری (Tech Stack)</w:t>
-      </w:r>
-    </w:p>
-    <w:p>
-      <w:pPr>
-        <w:jc w:val="right"/>
-        <w:bidi w:val="1"/>
-      </w:pPr>
-      <w:r>
-        <w:rPr>
-          <w:rFonts w:ascii="Vazirmatn" w:hAnsi="Vazirmatn"/>
-          <w:rtl w:val="1"/>
-          <w:rFonts w:ascii="Vazirmatn" w:hAnsi="Vazirmatn" w:cs="Vazirmatn" w:eastAsia="Vazirmatn"/>
+          <w:color w:val="212529"/>
         </w:rPr>
         <w:t>فرانت‌اند این سیستم به طور کامل با فریم‌ورک Astro و با استفاده از آداپتور @astrojs/node برای حالت Server-Side Rendering (SSR) پیاده‌سازی شده است. این انتخاب به دلیل سرعت بالای بارگذاری و امکان اجرای کدهای سمت سرور (جهت برقراری ارتباط امن با بک‌اند) صورت گرفته است. استایل‌دهی نیز با استفاده از CSS خام مدرن با تم تاریک (Dark Mode) و کلاس‌های شیشه‌ای (Glassmorphism) انجام شده است.</w:t>
       </w:r>
@@ -610,51 +1490,221 @@
     <w:p>
       <w:pPr>
         <w:pStyle w:val="Heading2"/>
+        <w:spacing w:before="280" w:after="120"/>
+        <w:jc w:val="right"/>
+        <w:bidi w:val="1"/>
+        <w:outlineLvl w:val="1"/>
+        <w:keepNext/>
+      </w:pPr>
+      <w:r>
+        <w:rPr>
+          <w:rFonts w:ascii="Vazirmatn" w:hAnsi="Vazirmatn"/>
+          <w:b/>
+          <w:color w:val="C2185B"/>
+          <w:sz w:val="30"/>
+          <w:rtl w:val="1"/>
+          <w:rFonts w:ascii="Vazirmatn" w:hAnsi="Vazirmatn" w:cs="Vazirmatn" w:eastAsia="Vazirmatn"/>
+          <w:color w:val="C2185B"/>
+        </w:rPr>
+        <w:t>۴.۲. کامپوننت‌های مهم و کلاس‌ها</w:t>
+      </w:r>
+    </w:p>
+    <w:p>
+      <w:pPr>
+        <w:spacing w:line="300" w:lineRule="auto" w:after="160"/>
         <w:jc w:val="right"/>
         <w:bidi w:val="1"/>
       </w:pPr>
       <w:r>
         <w:rPr>
           <w:rFonts w:ascii="Vazirmatn" w:hAnsi="Vazirmatn"/>
+          <w:color w:val="212529"/>
+          <w:sz w:val="22"/>
           <w:rtl w:val="1"/>
           <w:rFonts w:ascii="Vazirmatn" w:hAnsi="Vazirmatn" w:cs="Vazirmatn" w:eastAsia="Vazirmatn"/>
+          <w:color w:val="212529"/>
         </w:rPr>
-        <w:t>۴.۲. کامپوننت‌های مهم و کلاس‌ها</w:t>
+        <w:t>مهم‌ترین بخش‌های پیاده‌سازی شده در فرانت‌اند عبارتند از:</w:t>
       </w:r>
     </w:p>
     <w:p>
       <w:pPr>
+        <w:pStyle w:val="Heading3"/>
+        <w:spacing w:before="200" w:after="80"/>
+        <w:jc w:val="right"/>
+        <w:bidi w:val="1"/>
+        <w:outlineLvl w:val="2"/>
+        <w:keepNext/>
+      </w:pPr>
+      <w:r>
+        <w:rPr>
+          <w:rFonts w:ascii="Vazirmatn" w:hAnsi="Vazirmatn"/>
+          <w:b/>
+          <w:color w:val="6A1B9A"/>
+          <w:sz w:val="26"/>
+          <w:rtl w:val="1"/>
+          <w:rFonts w:ascii="Vazirmatn" w:hAnsi="Vazirmatn" w:cs="Vazirmatn" w:eastAsia="Vazirmatn"/>
+          <w:color w:val="6A1B9A"/>
+        </w:rPr>
+        <w:t>۴.۲.۱. کامپوننت رابط کاربری چت (ChatInterface.astro)</w:t>
+      </w:r>
+    </w:p>
+    <w:p>
+      <w:pPr>
+        <w:spacing w:line="300" w:lineRule="auto" w:after="160"/>
         <w:jc w:val="right"/>
         <w:bidi w:val="1"/>
       </w:pPr>
       <w:r>
         <w:rPr>
           <w:rFonts w:ascii="Vazirmatn" w:hAnsi="Vazirmatn"/>
+          <w:color w:val="212529"/>
+          <w:sz w:val="22"/>
           <w:rtl w:val="1"/>
           <w:rFonts w:ascii="Vazirmatn" w:hAnsi="Vazirmatn" w:cs="Vazirmatn" w:eastAsia="Vazirmatn"/>
+          <w:color w:val="212529"/>
         </w:rPr>
-        <w:t>مهم‌ترین بخش‌های پیاده‌سازی شده در فرانت‌اند عبارتند از:</w:t>
-        <w:br/>
-        <w:t>- ChatInterface.astro: اصلی‌ترین کامپوننت که شامل فرم ورودی، انتخابگر مدل (Model Selector)، تب‌های انتخاب حالت (عمومی، تکنیکال، بنیادین، کدنویسی) و نمایش پیام‌ها است.</w:t>
-        <w:br/>
-        <w:t>- ChatMessage.astro: کامپوننت نمایش حباب‌های چت کاربر و ایجنت. این کامپوننت کلاس‌های راست‌چین (rtl-text) را برای متون فارسی اعمال کرده و قیمت هر درخواست را نیز نشان می‌دهد.</w:t>
-        <w:br/>
-        <w:t>- Sidebar.astro: سایدبار پروژه که شامل دکمه ایجاد چت جدید و کارت‌های سناریوهای آماده (تحلیل BTC 1m، جریان پول هوشمند، رفتار ماینرها) با استایل‌های کنتراست بالا (High Contrast) می‌باشد.</w:t>
-        <w:br/>
-        <w:t>- api/chat.ts: اندپوینت سمت سرور در Astro که وظیفه برقراری ارتباط (Proxy) با بک‌اند هوش مصنوعی (Agno Orchestrator) را بر عهده دارد.</w:t>
+        <w:t>اصلی‌ترین کامپوننت که شامل فرم ورودی، انتخابگر مدل (Model Selector)، تب‌های انتخاب حالت (عمومی، تکنیکال، بنیادین، کدنویسی) و نمایش پیام‌ها است.</w:t>
       </w:r>
     </w:p>
     <w:p>
       <w:pPr>
-        <w:pStyle w:val="Heading1"/>
+        <w:pStyle w:val="Heading3"/>
+        <w:spacing w:before="200" w:after="80"/>
+        <w:jc w:val="right"/>
+        <w:bidi w:val="1"/>
+        <w:outlineLvl w:val="2"/>
+        <w:keepNext/>
+      </w:pPr>
+      <w:r>
+        <w:rPr>
+          <w:rFonts w:ascii="Vazirmatn" w:hAnsi="Vazirmatn"/>
+          <w:b/>
+          <w:color w:val="6A1B9A"/>
+          <w:sz w:val="26"/>
+          <w:rtl w:val="1"/>
+          <w:rFonts w:ascii="Vazirmatn" w:hAnsi="Vazirmatn" w:cs="Vazirmatn" w:eastAsia="Vazirmatn"/>
+          <w:color w:val="6A1B9A"/>
+        </w:rPr>
+        <w:t>۴.۲.۲. کامپوننت نمایش پیام (ChatMessage.astro)</w:t>
+      </w:r>
+    </w:p>
+    <w:p>
+      <w:pPr>
+        <w:spacing w:line="300" w:lineRule="auto" w:after="160"/>
         <w:jc w:val="right"/>
         <w:bidi w:val="1"/>
       </w:pPr>
       <w:r>
         <w:rPr>
           <w:rFonts w:ascii="Vazirmatn" w:hAnsi="Vazirmatn"/>
+          <w:color w:val="212529"/>
+          <w:sz w:val="22"/>
           <w:rtl w:val="1"/>
           <w:rFonts w:ascii="Vazirmatn" w:hAnsi="Vazirmatn" w:cs="Vazirmatn" w:eastAsia="Vazirmatn"/>
+          <w:color w:val="212529"/>
+        </w:rPr>
+        <w:t>کامپوننت نمایش حباب‌های چت کاربر و ایجنت. این کامپوننت کلاس‌های راست‌چین (rtl-text) را برای متون فارسی اعمال کرده و قیمت هر درخواست را نیز نشان می‌دهد.</w:t>
+      </w:r>
+    </w:p>
+    <w:p>
+      <w:pPr>
+        <w:pStyle w:val="Heading3"/>
+        <w:spacing w:before="200" w:after="80"/>
+        <w:jc w:val="right"/>
+        <w:bidi w:val="1"/>
+        <w:outlineLvl w:val="2"/>
+        <w:keepNext/>
+      </w:pPr>
+      <w:r>
+        <w:rPr>
+          <w:rFonts w:ascii="Vazirmatn" w:hAnsi="Vazirmatn"/>
+          <w:b/>
+          <w:color w:val="6A1B9A"/>
+          <w:sz w:val="26"/>
+          <w:rtl w:val="1"/>
+          <w:rFonts w:ascii="Vazirmatn" w:hAnsi="Vazirmatn" w:cs="Vazirmatn" w:eastAsia="Vazirmatn"/>
+          <w:color w:val="6A1B9A"/>
+        </w:rPr>
+        <w:t>۴.۲.۳. کامپوننت نوار کناری (Sidebar.astro)</w:t>
+      </w:r>
+    </w:p>
+    <w:p>
+      <w:pPr>
+        <w:spacing w:line="300" w:lineRule="auto" w:after="160"/>
+        <w:jc w:val="right"/>
+        <w:bidi w:val="1"/>
+      </w:pPr>
+      <w:r>
+        <w:rPr>
+          <w:rFonts w:ascii="Vazirmatn" w:hAnsi="Vazirmatn"/>
+          <w:color w:val="212529"/>
+          <w:sz w:val="22"/>
+          <w:rtl w:val="1"/>
+          <w:rFonts w:ascii="Vazirmatn" w:hAnsi="Vazirmatn" w:cs="Vazirmatn" w:eastAsia="Vazirmatn"/>
+          <w:color w:val="212529"/>
+        </w:rPr>
+        <w:t>سایدبار پروژه که شامل دکمه ایجاد چت جدید و کارت‌های سناریوهای آماده (تحلیل BTC 1m، جریان پول هوشمند، رفتار ماینرها) با استایل‌های کنتراست بالا (High Contrast) می‌باشد.</w:t>
+      </w:r>
+    </w:p>
+    <w:p>
+      <w:pPr>
+        <w:pStyle w:val="Heading3"/>
+        <w:spacing w:before="200" w:after="80"/>
+        <w:jc w:val="right"/>
+        <w:bidi w:val="1"/>
+        <w:outlineLvl w:val="2"/>
+        <w:keepNext/>
+      </w:pPr>
+      <w:r>
+        <w:rPr>
+          <w:rFonts w:ascii="Vazirmatn" w:hAnsi="Vazirmatn"/>
+          <w:b/>
+          <w:color w:val="6A1B9A"/>
+          <w:sz w:val="26"/>
+          <w:rtl w:val="1"/>
+          <w:rFonts w:ascii="Vazirmatn" w:hAnsi="Vazirmatn" w:cs="Vazirmatn" w:eastAsia="Vazirmatn"/>
+          <w:color w:val="6A1B9A"/>
+        </w:rPr>
+        <w:t>۴.۲.۴. اندپوینت API سمت سرور (api/chat.ts)</w:t>
+      </w:r>
+    </w:p>
+    <w:p>
+      <w:pPr>
+        <w:spacing w:line="300" w:lineRule="auto" w:after="160"/>
+        <w:jc w:val="right"/>
+        <w:bidi w:val="1"/>
+      </w:pPr>
+      <w:r>
+        <w:rPr>
+          <w:rFonts w:ascii="Vazirmatn" w:hAnsi="Vazirmatn"/>
+          <w:color w:val="212529"/>
+          <w:sz w:val="22"/>
+          <w:rtl w:val="1"/>
+          <w:rFonts w:ascii="Vazirmatn" w:hAnsi="Vazirmatn" w:cs="Vazirmatn" w:eastAsia="Vazirmatn"/>
+          <w:color w:val="212529"/>
+        </w:rPr>
+        <w:t>اندپوینت سمت سرور در Astro که وظیفه برقراری ارتباط (Proxy) با بک‌اند هوش مصنوعی (Agno Orchestrator) را بر عهده دارد.</w:t>
+      </w:r>
+    </w:p>
+    <w:p>
+      <w:pPr>
+        <w:pStyle w:val="Heading1"/>
+        <w:spacing w:before="360" w:after="160"/>
+        <w:jc w:val="right"/>
+        <w:bidi w:val="1"/>
+        <w:outlineLvl w:val="0"/>
+        <w:keepNext/>
+      </w:pPr>
+      <w:r>
+        <w:rPr>
+          <w:rFonts w:ascii="Vazirmatn" w:hAnsi="Vazirmatn"/>
+          <w:b/>
+          <w:color w:val="E91E63"/>
+          <w:sz w:val="36"/>
+          <w:rtl w:val="1"/>
+          <w:rFonts w:ascii="Vazirmatn" w:hAnsi="Vazirmatn" w:cs="Vazirmatn" w:eastAsia="Vazirmatn"/>
+          <w:color w:val="E91E63"/>
         </w:rPr>
         <w:t>۵. تست و ارزیابی سیستم (Testing &amp; Quality Assurance)</w:t>
       </w:r>
@@ -662,100 +1712,439 @@
     <w:p>
       <w:pPr>
         <w:pStyle w:val="Heading2"/>
+        <w:spacing w:before="280" w:after="120"/>
+        <w:jc w:val="right"/>
+        <w:bidi w:val="1"/>
+        <w:outlineLvl w:val="1"/>
+        <w:keepNext/>
+      </w:pPr>
+      <w:r>
+        <w:rPr>
+          <w:rFonts w:ascii="Vazirmatn" w:hAnsi="Vazirmatn"/>
+          <w:b/>
+          <w:color w:val="C2185B"/>
+          <w:sz w:val="30"/>
+          <w:rtl w:val="1"/>
+          <w:rFonts w:ascii="Vazirmatn" w:hAnsi="Vazirmatn" w:cs="Vazirmatn" w:eastAsia="Vazirmatn"/>
+          <w:color w:val="C2185B"/>
+        </w:rPr>
+        <w:t>۵.۱. تست‌های واحد و یکپارچه‌سازی بک‌اند (Pytest Suite)</w:t>
+      </w:r>
+    </w:p>
+    <w:p>
+      <w:pPr>
+        <w:spacing w:line="300" w:lineRule="auto" w:after="160"/>
         <w:jc w:val="right"/>
         <w:bidi w:val="1"/>
       </w:pPr>
       <w:r>
         <w:rPr>
           <w:rFonts w:ascii="Vazirmatn" w:hAnsi="Vazirmatn"/>
+          <w:color w:val="212529"/>
+          <w:sz w:val="22"/>
           <w:rtl w:val="1"/>
           <w:rFonts w:ascii="Vazirmatn" w:hAnsi="Vazirmatn" w:cs="Vazirmatn" w:eastAsia="Vazirmatn"/>
+          <w:color w:val="212529"/>
         </w:rPr>
-        <w:t>۵.۱. تست‌های واحد و یکپارچه‌سازی بک‌اند (Pytest Suite)</w:t>
+        <w:t>جهت حصول اطمینان از صحت عملکرد ایجنت‌ها، ابزارهای تحلیلی و کامپوننت هماهنگ‌کننده، یک مجموعه جامع از تست‌های واحد و یکپارچه‌سازی با فریم‌ورک Pytest پیاده‌سازی شده است (شامل ۱۶ تست با موفقیت ۱۰۰٪). مهم‌ترین بخش‌های تست شده عبارتند از:</w:t>
       </w:r>
     </w:p>
     <w:p>
       <w:pPr>
+        <w:pStyle w:val="Heading3"/>
+        <w:spacing w:before="200" w:after="80"/>
+        <w:jc w:val="right"/>
+        <w:bidi w:val="1"/>
+        <w:outlineLvl w:val="2"/>
+        <w:keepNext/>
+      </w:pPr>
+      <w:r>
+        <w:rPr>
+          <w:rFonts w:ascii="Vazirmatn" w:hAnsi="Vazirmatn"/>
+          <w:b/>
+          <w:color w:val="6A1B9A"/>
+          <w:sz w:val="26"/>
+          <w:rtl w:val="1"/>
+          <w:rFonts w:ascii="Vazirmatn" w:hAnsi="Vazirmatn" w:cs="Vazirmatn" w:eastAsia="Vazirmatn"/>
+          <w:color w:val="6A1B9A"/>
+        </w:rPr>
+        <w:t>۵.۱.۱. تست‌های ورودی چت و ایجنت (test_chat_bot.py)</w:t>
+      </w:r>
+    </w:p>
+    <w:p>
+      <w:pPr>
+        <w:spacing w:line="300" w:lineRule="auto" w:after="160"/>
         <w:jc w:val="right"/>
         <w:bidi w:val="1"/>
       </w:pPr>
       <w:r>
         <w:rPr>
           <w:rFonts w:ascii="Vazirmatn" w:hAnsi="Vazirmatn"/>
+          <w:color w:val="212529"/>
+          <w:sz w:val="22"/>
           <w:rtl w:val="1"/>
           <w:rFonts w:ascii="Vazirmatn" w:hAnsi="Vazirmatn" w:cs="Vazirmatn" w:eastAsia="Vazirmatn"/>
+          <w:color w:val="212529"/>
         </w:rPr>
-        <w:t>جهت حصول اطمینان از صحت عملکرد ایجنت‌ها، ابزارهای تحلیلی و کامپوننت هماهنگ‌کننده، یک مجموعه جامع از تست‌های واحد و یکپارچه‌سازی با فریم‌ورک Pytest پیاده‌سازی شده است (شامل ۱۶ تست با موفقیت ۱۰۰٪). مهم‌ترین بخش‌های تست شده عبارتند از:</w:t>
-        <w:br/>
-        <w:t>- test_chat_bot.py: ارزیابی تابع اصلی ورودی چت، مدیریت ورودی‌های خالی و شبیه‌سازی (Mocking) پاسخ‌های ایجنت Agno شامل محاسبه توکن‌ها و هزینه درخواست.</w:t>
-        <w:br/>
-        <w:t>- test_fundamental_tools.py: تست ابزارهای آن‌چین در FundamentalToolKit مانند خلاصه متریال‌های بنیادی، متدهای لیست‌گیری و استخراج داده‌های جریان پول هوشمند (Smart Money Flow) و خالص جریان صرافی‌ها (Exchange Netflow).</w:t>
-        <w:br/>
-        <w:t>- test_orchestrator.py: تست توابع هماهنگ‌کننده شامل تخمین توکن‌ها (estimate_tokens)، قالب‌بندی بافت تاریخچه مکالمه (format_history_context)، محاسبه قیمت دقیق مدل‌های مختلف (gpt-4o-mini, o3-mini, gpt-4.5-preview) و اجرای حالت جایگزین (Fallback).</w:t>
-        <w:br/>
-        <w:t>- test_ta_tools.py: سنجش ابزارهای تحلیل تکنیکال TAToolKit شامل خلاصه نمودار، دریافت کندل‌های OHLCV، محاسبه آمار قیمت (Highest High و Lowest Low) و پردازش خروجی اندیکاتورهای RSI, Aroon و MACD.</w:t>
+        <w:t>ارزیابی تابع اصلی ورودی چت، مدیریت ورودی‌های خالی و شبیه‌سازی (Mocking) پاسخ‌های ایجنت Agno شامل محاسبه توکن‌ها و هزینه درخواست.</w:t>
       </w:r>
     </w:p>
     <w:p>
       <w:pPr>
-        <w:pStyle w:val="Heading2"/>
+        <w:pStyle w:val="Heading3"/>
+        <w:spacing w:before="200" w:after="80"/>
+        <w:jc w:val="right"/>
+        <w:bidi w:val="1"/>
+        <w:outlineLvl w:val="2"/>
+        <w:keepNext/>
+      </w:pPr>
+      <w:r>
+        <w:rPr>
+          <w:rFonts w:ascii="Vazirmatn" w:hAnsi="Vazirmatn"/>
+          <w:b/>
+          <w:color w:val="6A1B9A"/>
+          <w:sz w:val="26"/>
+          <w:rtl w:val="1"/>
+          <w:rFonts w:ascii="Vazirmatn" w:hAnsi="Vazirmatn" w:cs="Vazirmatn" w:eastAsia="Vazirmatn"/>
+          <w:color w:val="6A1B9A"/>
+        </w:rPr>
+        <w:t>۵.۱.۲. تست ابزارهای بنیادی (test_fundamental_tools.py)</w:t>
+      </w:r>
+    </w:p>
+    <w:p>
+      <w:pPr>
+        <w:spacing w:line="300" w:lineRule="auto" w:after="160"/>
         <w:jc w:val="right"/>
         <w:bidi w:val="1"/>
       </w:pPr>
       <w:r>
         <w:rPr>
           <w:rFonts w:ascii="Vazirmatn" w:hAnsi="Vazirmatn"/>
+          <w:color w:val="212529"/>
+          <w:sz w:val="22"/>
           <w:rtl w:val="1"/>
           <w:rFonts w:ascii="Vazirmatn" w:hAnsi="Vazirmatn" w:cs="Vazirmatn" w:eastAsia="Vazirmatn"/>
+          <w:color w:val="212529"/>
+        </w:rPr>
+        <w:t>تست ابزارهای آن‌چین در FundamentalToolKit مانند خلاصه متریال‌های بنیادی، متدهای لیست‌گیری و استخراج داده‌های جریان پول هوشمند و خالص جریان صرافی‌ها.</w:t>
+      </w:r>
+    </w:p>
+    <w:p>
+      <w:pPr>
+        <w:pStyle w:val="Heading3"/>
+        <w:spacing w:before="200" w:after="80"/>
+        <w:jc w:val="right"/>
+        <w:bidi w:val="1"/>
+        <w:outlineLvl w:val="2"/>
+        <w:keepNext/>
+      </w:pPr>
+      <w:r>
+        <w:rPr>
+          <w:rFonts w:ascii="Vazirmatn" w:hAnsi="Vazirmatn"/>
+          <w:b/>
+          <w:color w:val="6A1B9A"/>
+          <w:sz w:val="26"/>
+          <w:rtl w:val="1"/>
+          <w:rFonts w:ascii="Vazirmatn" w:hAnsi="Vazirmatn" w:cs="Vazirmatn" w:eastAsia="Vazirmatn"/>
+          <w:color w:val="6A1B9A"/>
+        </w:rPr>
+        <w:t>۵.۱.۳. تست هماهنگ‌کننده و قیمت‌گذاری (test_orchestrator.py)</w:t>
+      </w:r>
+    </w:p>
+    <w:p>
+      <w:pPr>
+        <w:spacing w:line="300" w:lineRule="auto" w:after="160"/>
+        <w:jc w:val="right"/>
+        <w:bidi w:val="1"/>
+      </w:pPr>
+      <w:r>
+        <w:rPr>
+          <w:rFonts w:ascii="Vazirmatn" w:hAnsi="Vazirmatn"/>
+          <w:color w:val="212529"/>
+          <w:sz w:val="22"/>
+          <w:rtl w:val="1"/>
+          <w:rFonts w:ascii="Vazirmatn" w:hAnsi="Vazirmatn" w:cs="Vazirmatn" w:eastAsia="Vazirmatn"/>
+          <w:color w:val="212529"/>
+        </w:rPr>
+        <w:t>تست توابع هماهنگ‌کننده شامل تخمین توکن‌ها، قالب‌بندی بافت تاریخچه مکالمه، محاسبه قیمت دقیق مدل‌های مختلف (gpt-4o-mini, o3-mini) و اجرای حالت جایگزین (Fallback).</w:t>
+      </w:r>
+    </w:p>
+    <w:p>
+      <w:pPr>
+        <w:pStyle w:val="Heading3"/>
+        <w:spacing w:before="200" w:after="80"/>
+        <w:jc w:val="right"/>
+        <w:bidi w:val="1"/>
+        <w:outlineLvl w:val="2"/>
+        <w:keepNext/>
+      </w:pPr>
+      <w:r>
+        <w:rPr>
+          <w:rFonts w:ascii="Vazirmatn" w:hAnsi="Vazirmatn"/>
+          <w:b/>
+          <w:color w:val="6A1B9A"/>
+          <w:sz w:val="26"/>
+          <w:rtl w:val="1"/>
+          <w:rFonts w:ascii="Vazirmatn" w:hAnsi="Vazirmatn" w:cs="Vazirmatn" w:eastAsia="Vazirmatn"/>
+          <w:color w:val="6A1B9A"/>
+        </w:rPr>
+        <w:t>۵.۱.۴. تست ابزارهای تکنیکال (test_ta_tools.py)</w:t>
+      </w:r>
+    </w:p>
+    <w:p>
+      <w:pPr>
+        <w:spacing w:line="300" w:lineRule="auto" w:after="160"/>
+        <w:jc w:val="right"/>
+        <w:bidi w:val="1"/>
+      </w:pPr>
+      <w:r>
+        <w:rPr>
+          <w:rFonts w:ascii="Vazirmatn" w:hAnsi="Vazirmatn"/>
+          <w:color w:val="212529"/>
+          <w:sz w:val="22"/>
+          <w:rtl w:val="1"/>
+          <w:rFonts w:ascii="Vazirmatn" w:hAnsi="Vazirmatn" w:cs="Vazirmatn" w:eastAsia="Vazirmatn"/>
+          <w:color w:val="212529"/>
+        </w:rPr>
+        <w:t>سنجش ابزارهای تحلیل تکنیکال TAToolKit شامل خلاصه نمودار، دریافت کندل‌های OHLCV، محاسبه آمار قیمت و پردازش خروجی اندیکاتورهای RSI, Aroon و MACD.</w:t>
+      </w:r>
+    </w:p>
+    <w:p>
+      <w:pPr>
+        <w:pStyle w:val="Heading3"/>
+        <w:spacing w:before="200" w:after="80"/>
+        <w:jc w:val="right"/>
+        <w:bidi w:val="1"/>
+        <w:outlineLvl w:val="2"/>
+        <w:keepNext/>
+      </w:pPr>
+      <w:r>
+        <w:rPr>
+          <w:rFonts w:ascii="Vazirmatn" w:hAnsi="Vazirmatn"/>
+          <w:b/>
+          <w:color w:val="6A1B9A"/>
+          <w:sz w:val="26"/>
+          <w:rtl w:val="1"/>
+          <w:rFonts w:ascii="Vazirmatn" w:hAnsi="Vazirmatn" w:cs="Vazirmatn" w:eastAsia="Vazirmatn"/>
+          <w:color w:val="6A1B9A"/>
+        </w:rPr>
+        <w:t>۵.۱.۵. تست عدم فراخوانی در احوال‌پرسی (test_auto_enrich_payloads_greeting)</w:t>
+      </w:r>
+    </w:p>
+    <w:p>
+      <w:pPr>
+        <w:spacing w:line="300" w:lineRule="auto" w:after="160"/>
+        <w:jc w:val="right"/>
+        <w:bidi w:val="1"/>
+      </w:pPr>
+      <w:r>
+        <w:rPr>
+          <w:rFonts w:ascii="Vazirmatn" w:hAnsi="Vazirmatn"/>
+          <w:color w:val="212529"/>
+          <w:sz w:val="22"/>
+          <w:rtl w:val="1"/>
+          <w:rFonts w:ascii="Vazirmatn" w:hAnsi="Vazirmatn" w:cs="Vazirmatn" w:eastAsia="Vazirmatn"/>
+          <w:color w:val="212529"/>
+        </w:rPr>
+        <w:t>تست تایید عدم فراخوانی APIهای خارجی Binance و CoinGecko هنگام ارسال پیام‌های احوال‌پرسی ساده (مانند 'hi').</w:t>
+      </w:r>
+    </w:p>
+    <w:p>
+      <w:pPr>
+        <w:pStyle w:val="Heading2"/>
+        <w:spacing w:before="280" w:after="120"/>
+        <w:jc w:val="right"/>
+        <w:bidi w:val="1"/>
+        <w:outlineLvl w:val="1"/>
+        <w:keepNext/>
+      </w:pPr>
+      <w:r>
+        <w:rPr>
+          <w:rFonts w:ascii="Vazirmatn" w:hAnsi="Vazirmatn"/>
+          <w:b/>
+          <w:color w:val="C2185B"/>
+          <w:sz w:val="30"/>
+          <w:rtl w:val="1"/>
+          <w:rFonts w:ascii="Vazirmatn" w:hAnsi="Vazirmatn" w:cs="Vazirmatn" w:eastAsia="Vazirmatn"/>
+          <w:color w:val="C2185B"/>
         </w:rPr>
         <w:t>۵.۲. تست محاسبات تریدینگ و لوریج</w:t>
       </w:r>
     </w:p>
     <w:p>
       <w:pPr>
+        <w:spacing w:line="300" w:lineRule="auto" w:after="160"/>
         <w:jc w:val="right"/>
         <w:bidi w:val="1"/>
       </w:pPr>
       <w:r>
         <w:rPr>
           <w:rFonts w:ascii="Vazirmatn" w:hAnsi="Vazirmatn"/>
+          <w:color w:val="212529"/>
+          <w:sz w:val="22"/>
           <w:rtl w:val="1"/>
           <w:rFonts w:ascii="Vazirmatn" w:hAnsi="Vazirmatn" w:cs="Vazirmatn" w:eastAsia="Vazirmatn"/>
+          <w:color w:val="212529"/>
         </w:rPr>
         <w:t>یکی از حساس‌ترین بخش‌های پروژه، اعتبارسنجی محاسبات تریدینگ است. در این راستا تست‌های دقیق برای توابع ریاضی زیر اجرا گردید:</w:t>
-        <w:br/>
-        <w:t>- محاسبه ضریب لوریج بر اساس درصد حد زیان: اعتبارسنجی فرمول LV = 90 / %SL و گرد کردن آن به سمت پایین.</w:t>
-        <w:br/>
-        <w:t>- محاسبه نسبت ریسک به ریوارد (Risk-Reward Ratio): ارزیابی نسبت سود به زیان برای پوزیشن‌های خرید (Long) و فروش (Short) بر اساس قیمت ورود، حد زیان و اهداف سود (TP1..N).</w:t>
-        <w:br/>
-        <w:t>- اعتبارسنجی پارامترهای معاملاتی (validate_trading_calculations): کنترل حد زیان متناسب با تایم‌فریم (مانند حداقل ۲٪ برای تایم‌فریم ۱۵ دقیقه) و صدور هشدار در صورت ریسک نامناسب.</w:t>
       </w:r>
     </w:p>
     <w:p>
       <w:pPr>
-        <w:pStyle w:val="Heading2"/>
+        <w:pStyle w:val="Heading3"/>
+        <w:spacing w:before="200" w:after="80"/>
+        <w:jc w:val="right"/>
+        <w:bidi w:val="1"/>
+        <w:outlineLvl w:val="2"/>
+        <w:keepNext/>
+      </w:pPr>
+      <w:r>
+        <w:rPr>
+          <w:rFonts w:ascii="Vazirmatn" w:hAnsi="Vazirmatn"/>
+          <w:b/>
+          <w:color w:val="6A1B9A"/>
+          <w:sz w:val="26"/>
+          <w:rtl w:val="1"/>
+          <w:rFonts w:ascii="Vazirmatn" w:hAnsi="Vazirmatn" w:cs="Vazirmatn" w:eastAsia="Vazirmatn"/>
+          <w:color w:val="6A1B9A"/>
+        </w:rPr>
+        <w:t>۵.۲.۱. محاسبه ضریب لوریج بر اساس درصد حد زیان</w:t>
+      </w:r>
+    </w:p>
+    <w:p>
+      <w:pPr>
+        <w:spacing w:line="300" w:lineRule="auto" w:after="160"/>
         <w:jc w:val="right"/>
         <w:bidi w:val="1"/>
       </w:pPr>
       <w:r>
         <w:rPr>
           <w:rFonts w:ascii="Vazirmatn" w:hAnsi="Vazirmatn"/>
+          <w:color w:val="212529"/>
+          <w:sz w:val="22"/>
           <w:rtl w:val="1"/>
           <w:rFonts w:ascii="Vazirmatn" w:hAnsi="Vazirmatn" w:cs="Vazirmatn" w:eastAsia="Vazirmatn"/>
+          <w:color w:val="212529"/>
+        </w:rPr>
+        <w:t>اعتبارسنجی فرمول LV = 90 / %SL و گرد کردن آن به سمت پایین.</w:t>
+      </w:r>
+    </w:p>
+    <w:p>
+      <w:pPr>
+        <w:pStyle w:val="Heading3"/>
+        <w:spacing w:before="200" w:after="80"/>
+        <w:jc w:val="right"/>
+        <w:bidi w:val="1"/>
+        <w:outlineLvl w:val="2"/>
+        <w:keepNext/>
+      </w:pPr>
+      <w:r>
+        <w:rPr>
+          <w:rFonts w:ascii="Vazirmatn" w:hAnsi="Vazirmatn"/>
+          <w:b/>
+          <w:color w:val="6A1B9A"/>
+          <w:sz w:val="26"/>
+          <w:rtl w:val="1"/>
+          <w:rFonts w:ascii="Vazirmatn" w:hAnsi="Vazirmatn" w:cs="Vazirmatn" w:eastAsia="Vazirmatn"/>
+          <w:color w:val="6A1B9A"/>
+        </w:rPr>
+        <w:t>۵.۲.۲. محاسبه نسبت ریسک به ریوارد (Risk-Reward Ratio)</w:t>
+      </w:r>
+    </w:p>
+    <w:p>
+      <w:pPr>
+        <w:spacing w:line="300" w:lineRule="auto" w:after="160"/>
+        <w:jc w:val="right"/>
+        <w:bidi w:val="1"/>
+      </w:pPr>
+      <w:r>
+        <w:rPr>
+          <w:rFonts w:ascii="Vazirmatn" w:hAnsi="Vazirmatn"/>
+          <w:color w:val="212529"/>
+          <w:sz w:val="22"/>
+          <w:rtl w:val="1"/>
+          <w:rFonts w:ascii="Vazirmatn" w:hAnsi="Vazirmatn" w:cs="Vazirmatn" w:eastAsia="Vazirmatn"/>
+          <w:color w:val="212529"/>
+        </w:rPr>
+        <w:t>ارزیابی نسبت سود به زیان برای پوزیشن‌های خرید (Long) و فروش (Short) بر اساس قیمت ورود، حد زیان و اهداف سود (TP1..N).</w:t>
+      </w:r>
+    </w:p>
+    <w:p>
+      <w:pPr>
+        <w:pStyle w:val="Heading3"/>
+        <w:spacing w:before="200" w:after="80"/>
+        <w:jc w:val="right"/>
+        <w:bidi w:val="1"/>
+        <w:outlineLvl w:val="2"/>
+        <w:keepNext/>
+      </w:pPr>
+      <w:r>
+        <w:rPr>
+          <w:rFonts w:ascii="Vazirmatn" w:hAnsi="Vazirmatn"/>
+          <w:b/>
+          <w:color w:val="6A1B9A"/>
+          <w:sz w:val="26"/>
+          <w:rtl w:val="1"/>
+          <w:rFonts w:ascii="Vazirmatn" w:hAnsi="Vazirmatn" w:cs="Vazirmatn" w:eastAsia="Vazirmatn"/>
+          <w:color w:val="6A1B9A"/>
+        </w:rPr>
+        <w:t>۵.۲.۳. اعتبارسنجی پارامترهای معاملاتی (validate_trading_calculations)</w:t>
+      </w:r>
+    </w:p>
+    <w:p>
+      <w:pPr>
+        <w:spacing w:line="300" w:lineRule="auto" w:after="160"/>
+        <w:jc w:val="right"/>
+        <w:bidi w:val="1"/>
+      </w:pPr>
+      <w:r>
+        <w:rPr>
+          <w:rFonts w:ascii="Vazirmatn" w:hAnsi="Vazirmatn"/>
+          <w:color w:val="212529"/>
+          <w:sz w:val="22"/>
+          <w:rtl w:val="1"/>
+          <w:rFonts w:ascii="Vazirmatn" w:hAnsi="Vazirmatn" w:cs="Vazirmatn" w:eastAsia="Vazirmatn"/>
+          <w:color w:val="212529"/>
+        </w:rPr>
+        <w:t>کنترل حد زیان متناسب با تایم‌فریم (مانند حداقل ۲٪ برای تایم‌فریم ۱۵ دقیقه) و صدور هشدار در صورت ریسک نامناسب.</w:t>
+      </w:r>
+    </w:p>
+    <w:p>
+      <w:pPr>
+        <w:pStyle w:val="Heading2"/>
+        <w:spacing w:before="280" w:after="120"/>
+        <w:jc w:val="right"/>
+        <w:bidi w:val="1"/>
+        <w:outlineLvl w:val="1"/>
+        <w:keepNext/>
+      </w:pPr>
+      <w:r>
+        <w:rPr>
+          <w:rFonts w:ascii="Vazirmatn" w:hAnsi="Vazirmatn"/>
+          <w:b/>
+          <w:color w:val="C2185B"/>
+          <w:sz w:val="30"/>
+          <w:rtl w:val="1"/>
+          <w:rFonts w:ascii="Vazirmatn" w:hAnsi="Vazirmatn" w:cs="Vazirmatn" w:eastAsia="Vazirmatn"/>
+          <w:color w:val="C2185B"/>
         </w:rPr>
         <w:t>۵.۳. تست آداپتور فرانت‌اند و API</w:t>
       </w:r>
     </w:p>
     <w:p>
       <w:pPr>
+        <w:spacing w:line="300" w:lineRule="auto" w:after="160"/>
         <w:jc w:val="right"/>
         <w:bidi w:val="1"/>
       </w:pPr>
       <w:r>
         <w:rPr>
           <w:rFonts w:ascii="Vazirmatn" w:hAnsi="Vazirmatn"/>
+          <w:color w:val="212529"/>
+          <w:sz w:val="22"/>
           <w:rtl w:val="1"/>
           <w:rFonts w:ascii="Vazirmatn" w:hAnsi="Vazirmatn" w:cs="Vazirmatn" w:eastAsia="Vazirmatn"/>
+          <w:color w:val="212529"/>
         </w:rPr>
         <w:t>در بخش فرانت‌اند Astro، اندپوینت api/chat.ts از نظر سرعت پاسخ‌دهی سمت سرور (SSR)، لایه‌بندی حباب‌های پیام، نمایش کارت‌های سناریو پیش‌فرض و مدیریت خطاهای شبکه مورد ارزیابی قرار گرفت تا تجربه کاربری روان و بلادرنگ برای کاربران تضمین گردد.</w:t>
       </w:r>
@@ -763,28 +2152,39 @@
     <w:p>
       <w:pPr>
         <w:pStyle w:val="Heading1"/>
+        <w:spacing w:before="360" w:after="160"/>
+        <w:jc w:val="right"/>
+        <w:bidi w:val="1"/>
+        <w:outlineLvl w:val="0"/>
+        <w:keepNext/>
+      </w:pPr>
+      <w:r>
+        <w:rPr>
+          <w:rFonts w:ascii="Vazirmatn" w:hAnsi="Vazirmatn"/>
+          <w:b/>
+          <w:color w:val="E91E63"/>
+          <w:sz w:val="36"/>
+          <w:rtl w:val="1"/>
+          <w:rFonts w:ascii="Vazirmatn" w:hAnsi="Vazirmatn" w:cs="Vazirmatn" w:eastAsia="Vazirmatn"/>
+          <w:color w:val="E91E63"/>
+        </w:rPr>
+        <w:t>۶. نتیجه‌گیری</w:t>
+      </w:r>
+    </w:p>
+    <w:p>
+      <w:pPr>
+        <w:spacing w:line="300" w:lineRule="auto" w:after="160"/>
         <w:jc w:val="right"/>
         <w:bidi w:val="1"/>
       </w:pPr>
       <w:r>
         <w:rPr>
           <w:rFonts w:ascii="Vazirmatn" w:hAnsi="Vazirmatn"/>
+          <w:color w:val="212529"/>
+          <w:sz w:val="22"/>
           <w:rtl w:val="1"/>
           <w:rFonts w:ascii="Vazirmatn" w:hAnsi="Vazirmatn" w:cs="Vazirmatn" w:eastAsia="Vazirmatn"/>
-        </w:rPr>
-        <w:t>۶. نتیجه‌گیری</w:t>
-      </w:r>
-    </w:p>
-    <w:p>
-      <w:pPr>
-        <w:jc w:val="right"/>
-        <w:bidi w:val="1"/>
-      </w:pPr>
-      <w:r>
-        <w:rPr>
-          <w:rFonts w:ascii="Vazirmatn" w:hAnsi="Vazirmatn"/>
-          <w:rtl w:val="1"/>
-          <w:rFonts w:ascii="Vazirmatn" w:hAnsi="Vazirmatn" w:cs="Vazirmatn" w:eastAsia="Vazirmatn"/>
+          <w:color w:val="212529"/>
         </w:rPr>
         <w:t>با مهاجرت از یک سیستم یکپارچه ساده به معماری ایجنت‌محور بر پایه Agno در بک‌اند، بهره‌گیری از پایگاه داده PostgreSQL و Redis جهت مدیریت مطمئن نشست‌ها و کارهای پیش‌زمینه، و استفاده از رابط کاربری سریع مبتنی بر Astro در فرانت‌اند، اکنون سیستم توانایی پردازش هوشمندانه‌تر درخواست‌ها، انتخاب ابزارهای مناسب برای هر نوع پرسش و ارائه تجربه کاربری بومی (فارسی و دارک مود) با کنتراست بالا را دارا می‌باشد.</w:t>
       </w:r>
@@ -794,6 +2194,7 @@
       <w:pgMar w:top="1440" w:right="1800" w:bottom="1440" w:left="1800" w:header="720" w:footer="720" w:gutter="0"/>
       <w:cols w:space="720"/>
       <w:docGrid w:linePitch="360"/>
+      <w:bidi w:val="1"/>
     </w:sectPr>
   </w:body>
 </w:document>
@@ -1162,6 +2563,17 @@
     <w:name w:val="Normal"/>
     <w:qFormat/>
     <w:rsid w:val="00FC693F"/>
+    <w:pPr>
+      <w:bidi w:val="1"/>
+      <w:jc w:val="right"/>
+    </w:pPr>
+    <w:rPr>
+      <w:rFonts w:ascii="Vazirmatn" w:hAnsi="Vazirmatn"/>
+      <w:color w:val="212529"/>
+      <w:sz w:val="22"/>
+      <w:rtl w:val="1"/>
+      <w:rFonts w:ascii="Vazirmatn" w:hAnsi="Vazirmatn" w:cs="Vazirmatn" w:eastAsia="Vazirmatn"/>
+    </w:rPr>
   </w:style>
   <w:style w:type="paragraph" w:styleId="Header">
     <w:name w:val="header"/>
@@ -1220,14 +2632,18 @@
       <w:keepLines/>
       <w:spacing w:before="480" w:after="0"/>
       <w:outlineLvl w:val="0"/>
+      <w:bidi w:val="1"/>
+      <w:jc w:val="right"/>
     </w:pPr>
     <w:rPr>
-      <w:rFonts w:asciiTheme="majorHAnsi" w:eastAsiaTheme="majorEastAsia" w:hAnsiTheme="majorHAnsi" w:cstheme="majorBidi"/>
+      <w:rFonts w:asciiTheme="majorHAnsi" w:eastAsiaTheme="majorEastAsia" w:hAnsiTheme="majorHAnsi" w:cstheme="majorBidi" w:ascii="Vazirmatn" w:hAnsi="Vazirmatn"/>
       <w:b/>
       <w:bCs/>
-      <w:color w:val="365F91" w:themeColor="accent1" w:themeShade="BF"/>
-      <w:sz w:val="28"/>
+      <w:color w:val="E91E63"/>
+      <w:sz w:val="36"/>
       <w:szCs w:val="28"/>
+      <w:rtl w:val="1"/>
+      <w:rFonts w:ascii="Vazirmatn" w:hAnsi="Vazirmatn" w:cs="Vazirmatn" w:eastAsia="Vazirmatn"/>
     </w:rPr>
   </w:style>
   <w:style w:type="paragraph" w:styleId="Heading2">
@@ -1244,14 +2660,18 @@
       <w:keepLines/>
       <w:spacing w:before="200" w:after="0"/>
       <w:outlineLvl w:val="1"/>
+      <w:bidi w:val="1"/>
+      <w:jc w:val="right"/>
     </w:pPr>
     <w:rPr>
-      <w:rFonts w:asciiTheme="majorHAnsi" w:eastAsiaTheme="majorEastAsia" w:hAnsiTheme="majorHAnsi" w:cstheme="majorBidi"/>
+      <w:rFonts w:asciiTheme="majorHAnsi" w:eastAsiaTheme="majorEastAsia" w:hAnsiTheme="majorHAnsi" w:cstheme="majorBidi" w:ascii="Vazirmatn" w:hAnsi="Vazirmatn"/>
       <w:b/>
       <w:bCs/>
-      <w:color w:val="4F81BD" w:themeColor="accent1"/>
-      <w:sz w:val="26"/>
+      <w:color w:val="C2185B"/>
+      <w:sz w:val="30"/>
       <w:szCs w:val="26"/>
+      <w:rtl w:val="1"/>
+      <w:rFonts w:ascii="Vazirmatn" w:hAnsi="Vazirmatn" w:cs="Vazirmatn" w:eastAsia="Vazirmatn"/>
     </w:rPr>
   </w:style>
   <w:style w:type="paragraph" w:styleId="Heading3">
@@ -1268,12 +2688,17 @@
       <w:keepLines/>
       <w:spacing w:before="200" w:after="0"/>
       <w:outlineLvl w:val="2"/>
+      <w:bidi w:val="1"/>
+      <w:jc w:val="right"/>
     </w:pPr>
     <w:rPr>
-      <w:rFonts w:asciiTheme="majorHAnsi" w:eastAsiaTheme="majorEastAsia" w:hAnsiTheme="majorHAnsi" w:cstheme="majorBidi"/>
+      <w:rFonts w:asciiTheme="majorHAnsi" w:eastAsiaTheme="majorEastAsia" w:hAnsiTheme="majorHAnsi" w:cstheme="majorBidi" w:ascii="Vazirmatn" w:hAnsi="Vazirmatn"/>
       <w:b/>
       <w:bCs/>
-      <w:color w:val="4F81BD" w:themeColor="accent1"/>
+      <w:color w:val="6A1B9A"/>
+      <w:sz w:val="26"/>
+      <w:rtl w:val="1"/>
+      <w:rFonts w:ascii="Vazirmatn" w:hAnsi="Vazirmatn" w:cs="Vazirmatn" w:eastAsia="Vazirmatn"/>
     </w:rPr>
   </w:style>
   <w:style w:type="paragraph" w:styleId="Heading4">
@@ -1509,14 +2934,18 @@
       </w:pBdr>
       <w:spacing w:after="300" w:line="240" w:lineRule="auto"/>
       <w:contextualSpacing/>
+      <w:bidi w:val="1"/>
+      <w:jc w:val="right"/>
     </w:pPr>
     <w:rPr>
-      <w:rFonts w:asciiTheme="majorHAnsi" w:eastAsiaTheme="majorEastAsia" w:hAnsiTheme="majorHAnsi" w:cstheme="majorBidi"/>
-      <w:color w:val="17365D" w:themeColor="text2" w:themeShade="BF"/>
+      <w:rFonts w:asciiTheme="majorHAnsi" w:eastAsiaTheme="majorEastAsia" w:hAnsiTheme="majorHAnsi" w:cstheme="majorBidi" w:ascii="Vazirmatn" w:hAnsi="Vazirmatn"/>
+      <w:color w:val="0F172A"/>
       <w:spacing w:val="5"/>
       <w:kern w:val="28"/>
-      <w:sz w:val="52"/>
+      <w:sz w:val="44"/>
       <w:szCs w:val="52"/>
+      <w:rtl w:val="1"/>
+      <w:rFonts w:ascii="Vazirmatn" w:hAnsi="Vazirmatn" w:cs="Vazirmatn" w:eastAsia="Vazirmatn"/>
     </w:rPr>
   </w:style>
   <w:style w:type="character" w:customStyle="1" w:styleId="TitleChar">

</xml_diff>